<commit_message>
class, inheritance with new features
</commit_message>
<xml_diff>
--- a/images/objects_fec.docx
+++ b/images/objects_fec.docx
@@ -3,6 +3,1766 @@
 <w:document xmlns:wpc="http://schemas.microsoft.com/office/word/2010/wordprocessingCanvas" xmlns:cx="http://schemas.microsoft.com/office/drawing/2014/chartex" xmlns:cx1="http://schemas.microsoft.com/office/drawing/2015/9/8/chartex" xmlns:cx2="http://schemas.microsoft.com/office/drawing/2015/10/21/chartex" xmlns:cx3="http://schemas.microsoft.com/office/drawing/2016/5/9/chartex" xmlns:cx4="http://schemas.microsoft.com/office/drawing/2016/5/10/chartex" xmlns:cx5="http://schemas.microsoft.com/office/drawing/2016/5/11/chartex" xmlns:cx6="http://schemas.microsoft.com/office/drawing/2016/5/12/chartex" xmlns:cx7="http://schemas.microsoft.com/office/drawing/2016/5/13/chartex" xmlns:cx8="http://schemas.microsoft.com/office/drawing/2016/5/14/chartex" xmlns:mc="http://schemas.openxmlformats.org/markup-compatibility/2006" xmlns:aink="http://schemas.microsoft.com/office/drawing/2016/ink" xmlns:am3d="http://schemas.microsoft.com/office/drawing/2017/model3d" xmlns:o="urn:schemas-microsoft-com:office:office" xmlns:oel="http://schemas.microsoft.com/office/2019/extlst" xmlns:r="http://schemas.openxmlformats.org/officeDocument/2006/relationships" xmlns:m="http://schemas.openxmlformats.org/officeDocument/2006/math" xmlns:v="urn:schemas-microsoft-com:vml" xmlns:wp14="http://schemas.microsoft.com/office/word/2010/wordprocessingDrawing" xmlns:wp="http://schemas.openxmlformats.org/drawingml/2006/wordprocessingDrawing" xmlns:w10="urn:schemas-microsoft-com:office:word" xmlns:w="http://schemas.openxmlformats.org/wordprocessingml/2006/main" xmlns:w14="http://schemas.microsoft.com/office/word/2010/wordml" xmlns:w15="http://schemas.microsoft.com/office/word/2012/wordml" xmlns:w16cex="http://schemas.microsoft.com/office/word/2018/wordml/cex" xmlns:w16cid="http://schemas.microsoft.com/office/word/2016/wordml/cid" xmlns:w16="http://schemas.microsoft.com/office/word/2018/wordml" xmlns:w16du="http://schemas.microsoft.com/office/word/2023/wordml/word16du" xmlns:w16sdtdh="http://schemas.microsoft.com/office/word/2020/wordml/sdtdatahash" xmlns:w16sdtfl="http://schemas.microsoft.com/office/word/2024/wordml/sdtformatlock" xmlns:w16se="http://schemas.microsoft.com/office/word/2015/wordml/symex" xmlns:wpg="http://schemas.microsoft.com/office/word/2010/wordprocessingGroup" xmlns:wpi="http://schemas.microsoft.com/office/word/2010/wordprocessingInk" xmlns:wne="http://schemas.microsoft.com/office/word/2006/wordml" xmlns:wps="http://schemas.microsoft.com/office/word/2010/wordprocessingShape" mc:Ignorable="w14 w15 w16se w16cid w16 w16cex w16sdtdh w16sdtfl w16du wp14">
   <w:body>
     <w:p>
+      <w:r>
+        <w:rPr>
+          <w:noProof/>
+        </w:rPr>
+        <mc:AlternateContent>
+          <mc:Choice Requires="wps">
+            <w:drawing>
+              <wp:anchor distT="0" distB="0" distL="114300" distR="114300" simplePos="0" relativeHeight="251718656" behindDoc="0" locked="0" layoutInCell="1" allowOverlap="1" wp14:anchorId="3360F4E4" wp14:editId="39FDEAEF">
+                <wp:simplePos x="0" y="0"/>
+                <wp:positionH relativeFrom="column">
+                  <wp:posOffset>1224280</wp:posOffset>
+                </wp:positionH>
+                <wp:positionV relativeFrom="paragraph">
+                  <wp:posOffset>1244600</wp:posOffset>
+                </wp:positionV>
+                <wp:extent cx="497840" cy="1031240"/>
+                <wp:effectExtent l="0" t="0" r="54610" b="54610"/>
+                <wp:wrapNone/>
+                <wp:docPr id="839679931" name="Straight Arrow Connector 30"/>
+                <wp:cNvGraphicFramePr/>
+                <a:graphic xmlns:a="http://schemas.openxmlformats.org/drawingml/2006/main">
+                  <a:graphicData uri="http://schemas.microsoft.com/office/word/2010/wordprocessingShape">
+                    <wps:wsp>
+                      <wps:cNvCnPr/>
+                      <wps:spPr>
+                        <a:xfrm>
+                          <a:off x="0" y="0"/>
+                          <a:ext cx="497840" cy="1031240"/>
+                        </a:xfrm>
+                        <a:prstGeom prst="straightConnector1">
+                          <a:avLst/>
+                        </a:prstGeom>
+                        <a:ln>
+                          <a:tailEnd type="triangle"/>
+                        </a:ln>
+                      </wps:spPr>
+                      <wps:style>
+                        <a:lnRef idx="1">
+                          <a:schemeClr val="accent6"/>
+                        </a:lnRef>
+                        <a:fillRef idx="0">
+                          <a:schemeClr val="accent6"/>
+                        </a:fillRef>
+                        <a:effectRef idx="0">
+                          <a:schemeClr val="accent6"/>
+                        </a:effectRef>
+                        <a:fontRef idx="minor">
+                          <a:schemeClr val="tx1"/>
+                        </a:fontRef>
+                      </wps:style>
+                      <wps:bodyPr/>
+                    </wps:wsp>
+                  </a:graphicData>
+                </a:graphic>
+              </wp:anchor>
+            </w:drawing>
+          </mc:Choice>
+          <mc:Fallback>
+            <w:pict>
+              <v:shapetype w14:anchorId="55BB1A75" id="_x0000_t32" coordsize="21600,21600" o:spt="32" o:oned="t" path="m,l21600,21600e" filled="f">
+                <v:path arrowok="t" fillok="f" o:connecttype="none"/>
+                <o:lock v:ext="edit" shapetype="t"/>
+              </v:shapetype>
+              <v:shape id="Straight Arrow Connector 30" o:spid="_x0000_s1026" type="#_x0000_t32" style="position:absolute;margin-left:96.4pt;margin-top:98pt;width:39.2pt;height:81.2pt;z-index:251718656;visibility:visible;mso-wrap-style:square;mso-wrap-distance-left:9pt;mso-wrap-distance-top:0;mso-wrap-distance-right:9pt;mso-wrap-distance-bottom:0;mso-position-horizontal:absolute;mso-position-horizontal-relative:text;mso-position-vertical:absolute;mso-position-vertical-relative:text" o:gfxdata="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" strokecolor="#4ea72e [3209]" strokeweight="1pt">
+                <v:stroke endarrow="block" joinstyle="miter"/>
+              </v:shape>
+            </w:pict>
+          </mc:Fallback>
+        </mc:AlternateContent>
+      </w:r>
+      <w:r>
+        <w:rPr>
+          <w:noProof/>
+        </w:rPr>
+        <mc:AlternateContent>
+          <mc:Choice Requires="wps">
+            <w:drawing>
+              <wp:anchor distT="0" distB="0" distL="114300" distR="114300" simplePos="0" relativeHeight="251717632" behindDoc="0" locked="0" layoutInCell="1" allowOverlap="1" wp14:anchorId="4872CAF4" wp14:editId="307F2C13">
+                <wp:simplePos x="0" y="0"/>
+                <wp:positionH relativeFrom="column">
+                  <wp:posOffset>248920</wp:posOffset>
+                </wp:positionH>
+                <wp:positionV relativeFrom="paragraph">
+                  <wp:posOffset>492760</wp:posOffset>
+                </wp:positionV>
+                <wp:extent cx="955040" cy="751840"/>
+                <wp:effectExtent l="0" t="0" r="16510" b="10160"/>
+                <wp:wrapNone/>
+                <wp:docPr id="1149368910" name="Rectangle 29"/>
+                <wp:cNvGraphicFramePr/>
+                <a:graphic xmlns:a="http://schemas.openxmlformats.org/drawingml/2006/main">
+                  <a:graphicData uri="http://schemas.microsoft.com/office/word/2010/wordprocessingShape">
+                    <wps:wsp>
+                      <wps:cNvSpPr/>
+                      <wps:spPr>
+                        <a:xfrm>
+                          <a:off x="0" y="0"/>
+                          <a:ext cx="955040" cy="751840"/>
+                        </a:xfrm>
+                        <a:prstGeom prst="rect">
+                          <a:avLst/>
+                        </a:prstGeom>
+                      </wps:spPr>
+                      <wps:style>
+                        <a:lnRef idx="2">
+                          <a:schemeClr val="accent1">
+                            <a:shade val="15000"/>
+                          </a:schemeClr>
+                        </a:lnRef>
+                        <a:fillRef idx="1">
+                          <a:schemeClr val="accent1"/>
+                        </a:fillRef>
+                        <a:effectRef idx="0">
+                          <a:schemeClr val="accent1"/>
+                        </a:effectRef>
+                        <a:fontRef idx="minor">
+                          <a:schemeClr val="lt1"/>
+                        </a:fontRef>
+                      </wps:style>
+                      <wps:txbx>
+                        <w:txbxContent>
+                          <w:p>
+                            <w:pPr>
+                              <w:jc w:val="center"/>
+                            </w:pPr>
+                            <w:r>
+                              <w:t>this</w:t>
+                            </w:r>
+                          </w:p>
+                        </w:txbxContent>
+                      </wps:txbx>
+                      <wps:bodyPr rot="0" spcFirstLastPara="0" vertOverflow="overflow" horzOverflow="overflow" vert="horz" wrap="square" lIns="91440" tIns="45720" rIns="91440" bIns="45720" numCol="1" spcCol="0" rtlCol="0" fromWordArt="0" anchor="ctr" anchorCtr="0" forceAA="0" compatLnSpc="1">
+                        <a:prstTxWarp prst="textNoShape">
+                          <a:avLst/>
+                        </a:prstTxWarp>
+                        <a:noAutofit/>
+                      </wps:bodyPr>
+                    </wps:wsp>
+                  </a:graphicData>
+                </a:graphic>
+              </wp:anchor>
+            </w:drawing>
+          </mc:Choice>
+          <mc:Fallback>
+            <w:pict>
+              <v:rect w14:anchorId="4872CAF4" id="Rectangle 29" o:spid="_x0000_s1026" style="position:absolute;margin-left:19.6pt;margin-top:38.8pt;width:75.2pt;height:59.2pt;z-index:251717632;visibility:visible;mso-wrap-style:square;mso-wrap-distance-left:9pt;mso-wrap-distance-top:0;mso-wrap-distance-right:9pt;mso-wrap-distance-bottom:0;mso-position-horizontal:absolute;mso-position-horizontal-relative:text;mso-position-vertical:absolute;mso-position-vertical-relative:text;v-text-anchor:middle" o:gfxdata="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" fillcolor="#156082 [3204]" strokecolor="#030e13 [484]" strokeweight="1.5pt">
+                <v:textbox>
+                  <w:txbxContent>
+                    <w:p>
+                      <w:pPr>
+                        <w:jc w:val="center"/>
+                      </w:pPr>
+                      <w:r>
+                        <w:t>this</w:t>
+                      </w:r>
+                    </w:p>
+                  </w:txbxContent>
+                </v:textbox>
+              </v:rect>
+            </w:pict>
+          </mc:Fallback>
+        </mc:AlternateContent>
+      </w:r>
+      <w:r>
+        <w:rPr>
+          <w:noProof/>
+        </w:rPr>
+        <mc:AlternateContent>
+          <mc:Choice Requires="wps">
+            <w:drawing>
+              <wp:anchor distT="0" distB="0" distL="114300" distR="114300" simplePos="0" relativeHeight="251682816" behindDoc="0" locked="0" layoutInCell="1" allowOverlap="1" wp14:anchorId="6B358165" wp14:editId="15C7092A">
+                <wp:simplePos x="0" y="0"/>
+                <wp:positionH relativeFrom="column">
+                  <wp:posOffset>1061720</wp:posOffset>
+                </wp:positionH>
+                <wp:positionV relativeFrom="paragraph">
+                  <wp:posOffset>2148840</wp:posOffset>
+                </wp:positionV>
+                <wp:extent cx="1569720" cy="1005840"/>
+                <wp:effectExtent l="0" t="0" r="11430" b="22860"/>
+                <wp:wrapNone/>
+                <wp:docPr id="2138225247" name="Rectangle: Rounded Corners 21"/>
+                <wp:cNvGraphicFramePr/>
+                <a:graphic xmlns:a="http://schemas.openxmlformats.org/drawingml/2006/main">
+                  <a:graphicData uri="http://schemas.microsoft.com/office/word/2010/wordprocessingShape">
+                    <wps:wsp>
+                      <wps:cNvSpPr/>
+                      <wps:spPr>
+                        <a:xfrm>
+                          <a:off x="0" y="0"/>
+                          <a:ext cx="1569720" cy="1005840"/>
+                        </a:xfrm>
+                        <a:prstGeom prst="roundRect">
+                          <a:avLst/>
+                        </a:prstGeom>
+                        <a:solidFill>
+                          <a:schemeClr val="accent2"/>
+                        </a:solidFill>
+                      </wps:spPr>
+                      <wps:style>
+                        <a:lnRef idx="2">
+                          <a:schemeClr val="accent1">
+                            <a:shade val="15000"/>
+                          </a:schemeClr>
+                        </a:lnRef>
+                        <a:fillRef idx="1">
+                          <a:schemeClr val="accent1"/>
+                        </a:fillRef>
+                        <a:effectRef idx="0">
+                          <a:schemeClr val="accent1"/>
+                        </a:effectRef>
+                        <a:fontRef idx="minor">
+                          <a:schemeClr val="lt1"/>
+                        </a:fontRef>
+                      </wps:style>
+                      <wps:txbx>
+                        <w:txbxContent>
+                          <w:p>
+                            <w:pPr>
+                              <w:jc w:val="center"/>
+                            </w:pPr>
+                            <w:r>
+                              <w:t>Id, name, salary, subject</w:t>
+                            </w:r>
+                          </w:p>
+                        </w:txbxContent>
+                      </wps:txbx>
+                      <wps:bodyPr rot="0" spcFirstLastPara="0" vertOverflow="overflow" horzOverflow="overflow" vert="horz" wrap="square" lIns="91440" tIns="45720" rIns="91440" bIns="45720" numCol="1" spcCol="0" rtlCol="0" fromWordArt="0" anchor="ctr" anchorCtr="0" forceAA="0" compatLnSpc="1">
+                        <a:prstTxWarp prst="textNoShape">
+                          <a:avLst/>
+                        </a:prstTxWarp>
+                        <a:noAutofit/>
+                      </wps:bodyPr>
+                    </wps:wsp>
+                  </a:graphicData>
+                </a:graphic>
+                <wp14:sizeRelH relativeFrom="margin">
+                  <wp14:pctWidth>0</wp14:pctWidth>
+                </wp14:sizeRelH>
+                <wp14:sizeRelV relativeFrom="margin">
+                  <wp14:pctHeight>0</wp14:pctHeight>
+                </wp14:sizeRelV>
+              </wp:anchor>
+            </w:drawing>
+          </mc:Choice>
+          <mc:Fallback>
+            <w:pict>
+              <v:roundrect w14:anchorId="6B358165" id="Rectangle: Rounded Corners 21" o:spid="_x0000_s1027" style="position:absolute;margin-left:83.6pt;margin-top:169.2pt;width:123.6pt;height:79.2pt;z-index:251682816;visibility:visible;mso-wrap-style:square;mso-width-percent:0;mso-height-percent:0;mso-wrap-distance-left:9pt;mso-wrap-distance-top:0;mso-wrap-distance-right:9pt;mso-wrap-distance-bottom:0;mso-position-horizontal:absolute;mso-position-horizontal-relative:text;mso-position-vertical:absolute;mso-position-vertical-relative:text;mso-width-percent:0;mso-height-percent:0;mso-width-relative:margin;mso-height-relative:margin;v-text-anchor:middle" arcsize="10923f" o:gfxdata="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" fillcolor="#e97132 [3205]" strokecolor="#030e13 [484]" strokeweight="1.5pt">
+                <v:stroke joinstyle="miter"/>
+                <v:textbox>
+                  <w:txbxContent>
+                    <w:p>
+                      <w:pPr>
+                        <w:jc w:val="center"/>
+                      </w:pPr>
+                      <w:r>
+                        <w:t>Id, name, salary, subject</w:t>
+                      </w:r>
+                    </w:p>
+                  </w:txbxContent>
+                </v:textbox>
+              </v:roundrect>
+            </w:pict>
+          </mc:Fallback>
+        </mc:AlternateContent>
+      </w:r>
+      <w:r>
+        <w:rPr>
+          <w:noProof/>
+        </w:rPr>
+        <mc:AlternateContent>
+          <mc:Choice Requires="wps">
+            <w:drawing>
+              <wp:anchor distT="0" distB="0" distL="114300" distR="114300" simplePos="0" relativeHeight="251716608" behindDoc="0" locked="0" layoutInCell="1" allowOverlap="1" wp14:anchorId="6B18681B" wp14:editId="5F68C1CE">
+                <wp:simplePos x="0" y="0"/>
+                <wp:positionH relativeFrom="column">
+                  <wp:posOffset>4531360</wp:posOffset>
+                </wp:positionH>
+                <wp:positionV relativeFrom="paragraph">
+                  <wp:posOffset>40640</wp:posOffset>
+                </wp:positionV>
+                <wp:extent cx="238760" cy="706120"/>
+                <wp:effectExtent l="0" t="38100" r="66040" b="17780"/>
+                <wp:wrapNone/>
+                <wp:docPr id="744407981" name="Straight Arrow Connector 28"/>
+                <wp:cNvGraphicFramePr/>
+                <a:graphic xmlns:a="http://schemas.openxmlformats.org/drawingml/2006/main">
+                  <a:graphicData uri="http://schemas.microsoft.com/office/word/2010/wordprocessingShape">
+                    <wps:wsp>
+                      <wps:cNvCnPr/>
+                      <wps:spPr>
+                        <a:xfrm flipV="1">
+                          <a:off x="0" y="0"/>
+                          <a:ext cx="238760" cy="706120"/>
+                        </a:xfrm>
+                        <a:prstGeom prst="straightConnector1">
+                          <a:avLst/>
+                        </a:prstGeom>
+                        <a:ln>
+                          <a:tailEnd type="triangle"/>
+                        </a:ln>
+                      </wps:spPr>
+                      <wps:style>
+                        <a:lnRef idx="1">
+                          <a:schemeClr val="accent6"/>
+                        </a:lnRef>
+                        <a:fillRef idx="0">
+                          <a:schemeClr val="accent6"/>
+                        </a:fillRef>
+                        <a:effectRef idx="0">
+                          <a:schemeClr val="accent6"/>
+                        </a:effectRef>
+                        <a:fontRef idx="minor">
+                          <a:schemeClr val="tx1"/>
+                        </a:fontRef>
+                      </wps:style>
+                      <wps:bodyPr/>
+                    </wps:wsp>
+                  </a:graphicData>
+                </a:graphic>
+              </wp:anchor>
+            </w:drawing>
+          </mc:Choice>
+          <mc:Fallback>
+            <w:pict>
+              <v:shape w14:anchorId="6F769AA9" id="Straight Arrow Connector 28" o:spid="_x0000_s1026" type="#_x0000_t32" style="position:absolute;margin-left:356.8pt;margin-top:3.2pt;width:18.8pt;height:55.6pt;flip:y;z-index:251716608;visibility:visible;mso-wrap-style:square;mso-wrap-distance-left:9pt;mso-wrap-distance-top:0;mso-wrap-distance-right:9pt;mso-wrap-distance-bottom:0;mso-position-horizontal:absolute;mso-position-horizontal-relative:text;mso-position-vertical:absolute;mso-position-vertical-relative:text" o:gfxdata="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" strokecolor="#4ea72e [3209]" strokeweight="1pt">
+                <v:stroke endarrow="block" joinstyle="miter"/>
+              </v:shape>
+            </w:pict>
+          </mc:Fallback>
+        </mc:AlternateContent>
+      </w:r>
+      <w:r>
+        <w:rPr>
+          <w:noProof/>
+        </w:rPr>
+        <mc:AlternateContent>
+          <mc:Choice Requires="wps">
+            <w:drawing>
+              <wp:anchor distT="0" distB="0" distL="114300" distR="114300" simplePos="0" relativeHeight="251715584" behindDoc="0" locked="0" layoutInCell="1" allowOverlap="1" wp14:anchorId="6C0F3C97" wp14:editId="78619313">
+                <wp:simplePos x="0" y="0"/>
+                <wp:positionH relativeFrom="column">
+                  <wp:posOffset>1203960</wp:posOffset>
+                </wp:positionH>
+                <wp:positionV relativeFrom="paragraph">
+                  <wp:posOffset>365760</wp:posOffset>
+                </wp:positionV>
+                <wp:extent cx="2382520" cy="370840"/>
+                <wp:effectExtent l="0" t="0" r="55880" b="86360"/>
+                <wp:wrapNone/>
+                <wp:docPr id="387283447" name="Straight Arrow Connector 27"/>
+                <wp:cNvGraphicFramePr/>
+                <a:graphic xmlns:a="http://schemas.openxmlformats.org/drawingml/2006/main">
+                  <a:graphicData uri="http://schemas.microsoft.com/office/word/2010/wordprocessingShape">
+                    <wps:wsp>
+                      <wps:cNvCnPr/>
+                      <wps:spPr>
+                        <a:xfrm>
+                          <a:off x="0" y="0"/>
+                          <a:ext cx="2382520" cy="370840"/>
+                        </a:xfrm>
+                        <a:prstGeom prst="straightConnector1">
+                          <a:avLst/>
+                        </a:prstGeom>
+                        <a:ln>
+                          <a:tailEnd type="triangle"/>
+                        </a:ln>
+                      </wps:spPr>
+                      <wps:style>
+                        <a:lnRef idx="1">
+                          <a:schemeClr val="accent6"/>
+                        </a:lnRef>
+                        <a:fillRef idx="0">
+                          <a:schemeClr val="accent6"/>
+                        </a:fillRef>
+                        <a:effectRef idx="0">
+                          <a:schemeClr val="accent6"/>
+                        </a:effectRef>
+                        <a:fontRef idx="minor">
+                          <a:schemeClr val="tx1"/>
+                        </a:fontRef>
+                      </wps:style>
+                      <wps:bodyPr/>
+                    </wps:wsp>
+                  </a:graphicData>
+                </a:graphic>
+              </wp:anchor>
+            </w:drawing>
+          </mc:Choice>
+          <mc:Fallback>
+            <w:pict>
+              <v:shape w14:anchorId="3208C11D" id="Straight Arrow Connector 27" o:spid="_x0000_s1026" type="#_x0000_t32" style="position:absolute;margin-left:94.8pt;margin-top:28.8pt;width:187.6pt;height:29.2pt;z-index:251715584;visibility:visible;mso-wrap-style:square;mso-wrap-distance-left:9pt;mso-wrap-distance-top:0;mso-wrap-distance-right:9pt;mso-wrap-distance-bottom:0;mso-position-horizontal:absolute;mso-position-horizontal-relative:text;mso-position-vertical:absolute;mso-position-vertical-relative:text" o:gfxdata="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" strokecolor="#4ea72e [3209]" strokeweight="1pt">
+                <v:stroke endarrow="block" joinstyle="miter"/>
+              </v:shape>
+            </w:pict>
+          </mc:Fallback>
+        </mc:AlternateContent>
+      </w:r>
+      <w:r>
+        <w:rPr>
+          <w:noProof/>
+        </w:rPr>
+        <mc:AlternateContent>
+          <mc:Choice Requires="wps">
+            <w:drawing>
+              <wp:anchor distT="0" distB="0" distL="114300" distR="114300" simplePos="0" relativeHeight="251714560" behindDoc="0" locked="0" layoutInCell="1" allowOverlap="1" wp14:anchorId="1760D2E6" wp14:editId="78878237">
+                <wp:simplePos x="0" y="0"/>
+                <wp:positionH relativeFrom="column">
+                  <wp:posOffset>355600</wp:posOffset>
+                </wp:positionH>
+                <wp:positionV relativeFrom="paragraph">
+                  <wp:posOffset>-25400</wp:posOffset>
+                </wp:positionV>
+                <wp:extent cx="863600" cy="381000"/>
+                <wp:effectExtent l="0" t="0" r="12700" b="19050"/>
+                <wp:wrapNone/>
+                <wp:docPr id="158230781" name="Text Box 23"/>
+                <wp:cNvGraphicFramePr/>
+                <a:graphic xmlns:a="http://schemas.openxmlformats.org/drawingml/2006/main">
+                  <a:graphicData uri="http://schemas.microsoft.com/office/word/2010/wordprocessingShape">
+                    <wps:wsp>
+                      <wps:cNvSpPr txBox="1"/>
+                      <wps:spPr>
+                        <a:xfrm>
+                          <a:off x="0" y="0"/>
+                          <a:ext cx="863600" cy="381000"/>
+                        </a:xfrm>
+                        <a:prstGeom prst="rect">
+                          <a:avLst/>
+                        </a:prstGeom>
+                        <a:solidFill>
+                          <a:schemeClr val="lt1"/>
+                        </a:solidFill>
+                        <a:ln w="6350">
+                          <a:solidFill>
+                            <a:prstClr val="black"/>
+                          </a:solidFill>
+                        </a:ln>
+                      </wps:spPr>
+                      <wps:txbx>
+                        <w:txbxContent>
+                          <w:p/>
+                        </w:txbxContent>
+                      </wps:txbx>
+                      <wps:bodyPr rot="0" spcFirstLastPara="0" vertOverflow="overflow" horzOverflow="overflow" vert="horz" wrap="square" lIns="91440" tIns="45720" rIns="91440" bIns="45720" numCol="1" spcCol="0" rtlCol="0" fromWordArt="0" anchor="t" anchorCtr="0" forceAA="0" compatLnSpc="1">
+                        <a:prstTxWarp prst="textNoShape">
+                          <a:avLst/>
+                        </a:prstTxWarp>
+                        <a:noAutofit/>
+                      </wps:bodyPr>
+                    </wps:wsp>
+                  </a:graphicData>
+                </a:graphic>
+              </wp:anchor>
+            </w:drawing>
+          </mc:Choice>
+          <mc:Fallback>
+            <w:pict>
+              <v:shapetype w14:anchorId="1760D2E6" id="_x0000_t202" coordsize="21600,21600" o:spt="202" path="m,l,21600r21600,l21600,xe">
+                <v:stroke joinstyle="miter"/>
+                <v:path gradientshapeok="t" o:connecttype="rect"/>
+              </v:shapetype>
+              <v:shape id="Text Box 23" o:spid="_x0000_s1028" type="#_x0000_t202" style="position:absolute;margin-left:28pt;margin-top:-2pt;width:68pt;height:30pt;z-index:251714560;visibility:visible;mso-wrap-style:square;mso-wrap-distance-left:9pt;mso-wrap-distance-top:0;mso-wrap-distance-right:9pt;mso-wrap-distance-bottom:0;mso-position-horizontal:absolute;mso-position-horizontal-relative:text;mso-position-vertical:absolute;mso-position-vertical-relative:text;v-text-anchor:top" o:gfxdata="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" fillcolor="white [3201]" strokeweight=".5pt">
+                <v:textbox>
+                  <w:txbxContent>
+                    <w:p/>
+                  </w:txbxContent>
+                </v:textbox>
+              </v:shape>
+            </w:pict>
+          </mc:Fallback>
+        </mc:AlternateContent>
+      </w:r>
+      <w:r>
+        <w:rPr>
+          <w:noProof/>
+        </w:rPr>
+        <mc:AlternateContent>
+          <mc:Choice Requires="wps">
+            <w:drawing>
+              <wp:anchor distT="0" distB="0" distL="114300" distR="114300" simplePos="0" relativeHeight="251712512" behindDoc="0" locked="0" layoutInCell="1" allowOverlap="1" wp14:anchorId="036D321C" wp14:editId="0F28198B">
+                <wp:simplePos x="0" y="0"/>
+                <wp:positionH relativeFrom="column">
+                  <wp:posOffset>4328160</wp:posOffset>
+                </wp:positionH>
+                <wp:positionV relativeFrom="paragraph">
+                  <wp:posOffset>1666240</wp:posOffset>
+                </wp:positionV>
+                <wp:extent cx="1000760" cy="254000"/>
+                <wp:effectExtent l="0" t="0" r="27940" b="12700"/>
+                <wp:wrapNone/>
+                <wp:docPr id="92765484" name="Text Box 9"/>
+                <wp:cNvGraphicFramePr/>
+                <a:graphic xmlns:a="http://schemas.openxmlformats.org/drawingml/2006/main">
+                  <a:graphicData uri="http://schemas.microsoft.com/office/word/2010/wordprocessingShape">
+                    <wps:wsp>
+                      <wps:cNvSpPr txBox="1"/>
+                      <wps:spPr>
+                        <a:xfrm>
+                          <a:off x="0" y="0"/>
+                          <a:ext cx="1000760" cy="254000"/>
+                        </a:xfrm>
+                        <a:prstGeom prst="rect">
+                          <a:avLst/>
+                        </a:prstGeom>
+                        <a:solidFill>
+                          <a:schemeClr val="lt1"/>
+                        </a:solidFill>
+                        <a:ln w="6350">
+                          <a:solidFill>
+                            <a:prstClr val="black"/>
+                          </a:solidFill>
+                        </a:ln>
+                      </wps:spPr>
+                      <wps:txbx>
+                        <w:txbxContent>
+                          <w:p>
+                            <w:r>
+                              <w:t>JavaScript</w:t>
+                            </w:r>
+                          </w:p>
+                        </w:txbxContent>
+                      </wps:txbx>
+                      <wps:bodyPr rot="0" spcFirstLastPara="0" vertOverflow="overflow" horzOverflow="overflow" vert="horz" wrap="square" lIns="91440" tIns="45720" rIns="91440" bIns="45720" numCol="1" spcCol="0" rtlCol="0" fromWordArt="0" anchor="t" anchorCtr="0" forceAA="0" compatLnSpc="1">
+                        <a:prstTxWarp prst="textNoShape">
+                          <a:avLst/>
+                        </a:prstTxWarp>
+                        <a:noAutofit/>
+                      </wps:bodyPr>
+                    </wps:wsp>
+                  </a:graphicData>
+                </a:graphic>
+              </wp:anchor>
+            </w:drawing>
+          </mc:Choice>
+          <mc:Fallback>
+            <w:pict>
+              <v:shape w14:anchorId="036D321C" id="Text Box 9" o:spid="_x0000_s1029" type="#_x0000_t202" style="position:absolute;margin-left:340.8pt;margin-top:131.2pt;width:78.8pt;height:20pt;z-index:251712512;visibility:visible;mso-wrap-style:square;mso-wrap-distance-left:9pt;mso-wrap-distance-top:0;mso-wrap-distance-right:9pt;mso-wrap-distance-bottom:0;mso-position-horizontal:absolute;mso-position-horizontal-relative:text;mso-position-vertical:absolute;mso-position-vertical-relative:text;v-text-anchor:top" o:gfxdata="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" fillcolor="white [3201]" strokeweight=".5pt">
+                <v:textbox>
+                  <w:txbxContent>
+                    <w:p>
+                      <w:r>
+                        <w:t>JavaScript</w:t>
+                      </w:r>
+                    </w:p>
+                  </w:txbxContent>
+                </v:textbox>
+              </v:shape>
+            </w:pict>
+          </mc:Fallback>
+        </mc:AlternateContent>
+      </w:r>
+      <w:r>
+        <w:rPr>
+          <w:noProof/>
+        </w:rPr>
+        <mc:AlternateContent>
+          <mc:Choice Requires="wps">
+            <w:drawing>
+              <wp:anchor distT="0" distB="0" distL="114300" distR="114300" simplePos="0" relativeHeight="251710464" behindDoc="0" locked="0" layoutInCell="1" allowOverlap="1" wp14:anchorId="05A1D671" wp14:editId="2CAC6F37">
+                <wp:simplePos x="0" y="0"/>
+                <wp:positionH relativeFrom="column">
+                  <wp:posOffset>4175760</wp:posOffset>
+                </wp:positionH>
+                <wp:positionV relativeFrom="paragraph">
+                  <wp:posOffset>1513840</wp:posOffset>
+                </wp:positionV>
+                <wp:extent cx="1000760" cy="254000"/>
+                <wp:effectExtent l="0" t="0" r="27940" b="12700"/>
+                <wp:wrapNone/>
+                <wp:docPr id="1143342718" name="Text Box 9"/>
+                <wp:cNvGraphicFramePr/>
+                <a:graphic xmlns:a="http://schemas.openxmlformats.org/drawingml/2006/main">
+                  <a:graphicData uri="http://schemas.microsoft.com/office/word/2010/wordprocessingShape">
+                    <wps:wsp>
+                      <wps:cNvSpPr txBox="1"/>
+                      <wps:spPr>
+                        <a:xfrm>
+                          <a:off x="0" y="0"/>
+                          <a:ext cx="1000760" cy="254000"/>
+                        </a:xfrm>
+                        <a:prstGeom prst="rect">
+                          <a:avLst/>
+                        </a:prstGeom>
+                        <a:solidFill>
+                          <a:schemeClr val="lt1"/>
+                        </a:solidFill>
+                        <a:ln w="6350">
+                          <a:solidFill>
+                            <a:prstClr val="black"/>
+                          </a:solidFill>
+                        </a:ln>
+                      </wps:spPr>
+                      <wps:txbx>
+                        <w:txbxContent>
+                          <w:p>
+                            <w:r>
+                              <w:t>JavaScript</w:t>
+                            </w:r>
+                          </w:p>
+                        </w:txbxContent>
+                      </wps:txbx>
+                      <wps:bodyPr rot="0" spcFirstLastPara="0" vertOverflow="overflow" horzOverflow="overflow" vert="horz" wrap="square" lIns="91440" tIns="45720" rIns="91440" bIns="45720" numCol="1" spcCol="0" rtlCol="0" fromWordArt="0" anchor="t" anchorCtr="0" forceAA="0" compatLnSpc="1">
+                        <a:prstTxWarp prst="textNoShape">
+                          <a:avLst/>
+                        </a:prstTxWarp>
+                        <a:noAutofit/>
+                      </wps:bodyPr>
+                    </wps:wsp>
+                  </a:graphicData>
+                </a:graphic>
+              </wp:anchor>
+            </w:drawing>
+          </mc:Choice>
+          <mc:Fallback>
+            <w:pict>
+              <v:shape w14:anchorId="05A1D671" id="_x0000_s1030" type="#_x0000_t202" style="position:absolute;margin-left:328.8pt;margin-top:119.2pt;width:78.8pt;height:20pt;z-index:251710464;visibility:visible;mso-wrap-style:square;mso-wrap-distance-left:9pt;mso-wrap-distance-top:0;mso-wrap-distance-right:9pt;mso-wrap-distance-bottom:0;mso-position-horizontal:absolute;mso-position-horizontal-relative:text;mso-position-vertical:absolute;mso-position-vertical-relative:text;v-text-anchor:top" o:gfxdata="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" fillcolor="white [3201]" strokeweight=".5pt">
+                <v:textbox>
+                  <w:txbxContent>
+                    <w:p>
+                      <w:r>
+                        <w:t>JavaScript</w:t>
+                      </w:r>
+                    </w:p>
+                  </w:txbxContent>
+                </v:textbox>
+              </v:shape>
+            </w:pict>
+          </mc:Fallback>
+        </mc:AlternateContent>
+      </w:r>
+      <w:r>
+        <w:rPr>
+          <w:noProof/>
+        </w:rPr>
+        <mc:AlternateContent>
+          <mc:Choice Requires="wps">
+            <w:drawing>
+              <wp:anchor distT="0" distB="0" distL="114300" distR="114300" simplePos="0" relativeHeight="251708416" behindDoc="0" locked="0" layoutInCell="1" allowOverlap="1" wp14:anchorId="4E5FEB4F" wp14:editId="50D31D8D">
+                <wp:simplePos x="0" y="0"/>
+                <wp:positionH relativeFrom="column">
+                  <wp:posOffset>4023360</wp:posOffset>
+                </wp:positionH>
+                <wp:positionV relativeFrom="paragraph">
+                  <wp:posOffset>1361440</wp:posOffset>
+                </wp:positionV>
+                <wp:extent cx="1000760" cy="254000"/>
+                <wp:effectExtent l="0" t="0" r="27940" b="12700"/>
+                <wp:wrapNone/>
+                <wp:docPr id="1078645495" name="Text Box 9"/>
+                <wp:cNvGraphicFramePr/>
+                <a:graphic xmlns:a="http://schemas.openxmlformats.org/drawingml/2006/main">
+                  <a:graphicData uri="http://schemas.microsoft.com/office/word/2010/wordprocessingShape">
+                    <wps:wsp>
+                      <wps:cNvSpPr txBox="1"/>
+                      <wps:spPr>
+                        <a:xfrm>
+                          <a:off x="0" y="0"/>
+                          <a:ext cx="1000760" cy="254000"/>
+                        </a:xfrm>
+                        <a:prstGeom prst="rect">
+                          <a:avLst/>
+                        </a:prstGeom>
+                        <a:solidFill>
+                          <a:schemeClr val="lt1"/>
+                        </a:solidFill>
+                        <a:ln w="6350">
+                          <a:solidFill>
+                            <a:prstClr val="black"/>
+                          </a:solidFill>
+                        </a:ln>
+                      </wps:spPr>
+                      <wps:txbx>
+                        <w:txbxContent>
+                          <w:p>
+                            <w:r>
+                              <w:t>JavaScript</w:t>
+                            </w:r>
+                          </w:p>
+                        </w:txbxContent>
+                      </wps:txbx>
+                      <wps:bodyPr rot="0" spcFirstLastPara="0" vertOverflow="overflow" horzOverflow="overflow" vert="horz" wrap="square" lIns="91440" tIns="45720" rIns="91440" bIns="45720" numCol="1" spcCol="0" rtlCol="0" fromWordArt="0" anchor="t" anchorCtr="0" forceAA="0" compatLnSpc="1">
+                        <a:prstTxWarp prst="textNoShape">
+                          <a:avLst/>
+                        </a:prstTxWarp>
+                        <a:noAutofit/>
+                      </wps:bodyPr>
+                    </wps:wsp>
+                  </a:graphicData>
+                </a:graphic>
+              </wp:anchor>
+            </w:drawing>
+          </mc:Choice>
+          <mc:Fallback>
+            <w:pict>
+              <v:shape w14:anchorId="4E5FEB4F" id="_x0000_s1031" type="#_x0000_t202" style="position:absolute;margin-left:316.8pt;margin-top:107.2pt;width:78.8pt;height:20pt;z-index:251708416;visibility:visible;mso-wrap-style:square;mso-wrap-distance-left:9pt;mso-wrap-distance-top:0;mso-wrap-distance-right:9pt;mso-wrap-distance-bottom:0;mso-position-horizontal:absolute;mso-position-horizontal-relative:text;mso-position-vertical:absolute;mso-position-vertical-relative:text;v-text-anchor:top" o:gfxdata="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" fillcolor="white [3201]" strokeweight=".5pt">
+                <v:textbox>
+                  <w:txbxContent>
+                    <w:p>
+                      <w:r>
+                        <w:t>JavaScript</w:t>
+                      </w:r>
+                    </w:p>
+                  </w:txbxContent>
+                </v:textbox>
+              </v:shape>
+            </w:pict>
+          </mc:Fallback>
+        </mc:AlternateContent>
+      </w:r>
+      <w:r>
+        <w:rPr>
+          <w:noProof/>
+        </w:rPr>
+        <mc:AlternateContent>
+          <mc:Choice Requires="wps">
+            <w:drawing>
+              <wp:anchor distT="0" distB="0" distL="114300" distR="114300" simplePos="0" relativeHeight="251706368" behindDoc="0" locked="0" layoutInCell="1" allowOverlap="1" wp14:anchorId="4A3F36F9" wp14:editId="762CCDEA">
+                <wp:simplePos x="0" y="0"/>
+                <wp:positionH relativeFrom="column">
+                  <wp:posOffset>3870960</wp:posOffset>
+                </wp:positionH>
+                <wp:positionV relativeFrom="paragraph">
+                  <wp:posOffset>1209040</wp:posOffset>
+                </wp:positionV>
+                <wp:extent cx="1000760" cy="254000"/>
+                <wp:effectExtent l="0" t="0" r="27940" b="12700"/>
+                <wp:wrapNone/>
+                <wp:docPr id="1642210800" name="Text Box 9"/>
+                <wp:cNvGraphicFramePr/>
+                <a:graphic xmlns:a="http://schemas.openxmlformats.org/drawingml/2006/main">
+                  <a:graphicData uri="http://schemas.microsoft.com/office/word/2010/wordprocessingShape">
+                    <wps:wsp>
+                      <wps:cNvSpPr txBox="1"/>
+                      <wps:spPr>
+                        <a:xfrm>
+                          <a:off x="0" y="0"/>
+                          <a:ext cx="1000760" cy="254000"/>
+                        </a:xfrm>
+                        <a:prstGeom prst="rect">
+                          <a:avLst/>
+                        </a:prstGeom>
+                        <a:solidFill>
+                          <a:schemeClr val="lt1"/>
+                        </a:solidFill>
+                        <a:ln w="6350">
+                          <a:solidFill>
+                            <a:prstClr val="black"/>
+                          </a:solidFill>
+                        </a:ln>
+                      </wps:spPr>
+                      <wps:txbx>
+                        <w:txbxContent>
+                          <w:p>
+                            <w:r>
+                              <w:t>JavaScript</w:t>
+                            </w:r>
+                          </w:p>
+                        </w:txbxContent>
+                      </wps:txbx>
+                      <wps:bodyPr rot="0" spcFirstLastPara="0" vertOverflow="overflow" horzOverflow="overflow" vert="horz" wrap="square" lIns="91440" tIns="45720" rIns="91440" bIns="45720" numCol="1" spcCol="0" rtlCol="0" fromWordArt="0" anchor="t" anchorCtr="0" forceAA="0" compatLnSpc="1">
+                        <a:prstTxWarp prst="textNoShape">
+                          <a:avLst/>
+                        </a:prstTxWarp>
+                        <a:noAutofit/>
+                      </wps:bodyPr>
+                    </wps:wsp>
+                  </a:graphicData>
+                </a:graphic>
+              </wp:anchor>
+            </w:drawing>
+          </mc:Choice>
+          <mc:Fallback>
+            <w:pict>
+              <v:shape w14:anchorId="4A3F36F9" id="_x0000_s1032" type="#_x0000_t202" style="position:absolute;margin-left:304.8pt;margin-top:95.2pt;width:78.8pt;height:20pt;z-index:251706368;visibility:visible;mso-wrap-style:square;mso-wrap-distance-left:9pt;mso-wrap-distance-top:0;mso-wrap-distance-right:9pt;mso-wrap-distance-bottom:0;mso-position-horizontal:absolute;mso-position-horizontal-relative:text;mso-position-vertical:absolute;mso-position-vertical-relative:text;v-text-anchor:top" o:gfxdata="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" fillcolor="white [3201]" strokeweight=".5pt">
+                <v:textbox>
+                  <w:txbxContent>
+                    <w:p>
+                      <w:r>
+                        <w:t>JavaScript</w:t>
+                      </w:r>
+                    </w:p>
+                  </w:txbxContent>
+                </v:textbox>
+              </v:shape>
+            </w:pict>
+          </mc:Fallback>
+        </mc:AlternateContent>
+      </w:r>
+      <w:r>
+        <w:rPr>
+          <w:noProof/>
+        </w:rPr>
+        <mc:AlternateContent>
+          <mc:Choice Requires="wps">
+            <w:drawing>
+              <wp:anchor distT="0" distB="0" distL="114300" distR="114300" simplePos="0" relativeHeight="251704320" behindDoc="0" locked="0" layoutInCell="1" allowOverlap="1" wp14:anchorId="30393D33" wp14:editId="0ACA4AA2">
+                <wp:simplePos x="0" y="0"/>
+                <wp:positionH relativeFrom="column">
+                  <wp:posOffset>3718560</wp:posOffset>
+                </wp:positionH>
+                <wp:positionV relativeFrom="paragraph">
+                  <wp:posOffset>1056640</wp:posOffset>
+                </wp:positionV>
+                <wp:extent cx="1000760" cy="254000"/>
+                <wp:effectExtent l="0" t="0" r="27940" b="12700"/>
+                <wp:wrapNone/>
+                <wp:docPr id="1883947509" name="Text Box 9"/>
+                <wp:cNvGraphicFramePr/>
+                <a:graphic xmlns:a="http://schemas.openxmlformats.org/drawingml/2006/main">
+                  <a:graphicData uri="http://schemas.microsoft.com/office/word/2010/wordprocessingShape">
+                    <wps:wsp>
+                      <wps:cNvSpPr txBox="1"/>
+                      <wps:spPr>
+                        <a:xfrm>
+                          <a:off x="0" y="0"/>
+                          <a:ext cx="1000760" cy="254000"/>
+                        </a:xfrm>
+                        <a:prstGeom prst="rect">
+                          <a:avLst/>
+                        </a:prstGeom>
+                        <a:solidFill>
+                          <a:schemeClr val="lt1"/>
+                        </a:solidFill>
+                        <a:ln w="6350">
+                          <a:solidFill>
+                            <a:prstClr val="black"/>
+                          </a:solidFill>
+                        </a:ln>
+                      </wps:spPr>
+                      <wps:txbx>
+                        <w:txbxContent>
+                          <w:p>
+                            <w:r>
+                              <w:t>JavaScript</w:t>
+                            </w:r>
+                          </w:p>
+                        </w:txbxContent>
+                      </wps:txbx>
+                      <wps:bodyPr rot="0" spcFirstLastPara="0" vertOverflow="overflow" horzOverflow="overflow" vert="horz" wrap="square" lIns="91440" tIns="45720" rIns="91440" bIns="45720" numCol="1" spcCol="0" rtlCol="0" fromWordArt="0" anchor="t" anchorCtr="0" forceAA="0" compatLnSpc="1">
+                        <a:prstTxWarp prst="textNoShape">
+                          <a:avLst/>
+                        </a:prstTxWarp>
+                        <a:noAutofit/>
+                      </wps:bodyPr>
+                    </wps:wsp>
+                  </a:graphicData>
+                </a:graphic>
+              </wp:anchor>
+            </w:drawing>
+          </mc:Choice>
+          <mc:Fallback>
+            <w:pict>
+              <v:shape w14:anchorId="30393D33" id="_x0000_s1033" type="#_x0000_t202" style="position:absolute;margin-left:292.8pt;margin-top:83.2pt;width:78.8pt;height:20pt;z-index:251704320;visibility:visible;mso-wrap-style:square;mso-wrap-distance-left:9pt;mso-wrap-distance-top:0;mso-wrap-distance-right:9pt;mso-wrap-distance-bottom:0;mso-position-horizontal:absolute;mso-position-horizontal-relative:text;mso-position-vertical:absolute;mso-position-vertical-relative:text;v-text-anchor:top" o:gfxdata="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" fillcolor="white [3201]" strokeweight=".5pt">
+                <v:textbox>
+                  <w:txbxContent>
+                    <w:p>
+                      <w:r>
+                        <w:t>JavaScript</w:t>
+                      </w:r>
+                    </w:p>
+                  </w:txbxContent>
+                </v:textbox>
+              </v:shape>
+            </w:pict>
+          </mc:Fallback>
+        </mc:AlternateContent>
+      </w:r>
+      <w:r>
+        <w:rPr>
+          <w:noProof/>
+        </w:rPr>
+        <mc:AlternateContent>
+          <mc:Choice Requires="wps">
+            <w:drawing>
+              <wp:anchor distT="0" distB="0" distL="114300" distR="114300" simplePos="0" relativeHeight="251698176" behindDoc="0" locked="0" layoutInCell="1" allowOverlap="1" wp14:anchorId="61E31118" wp14:editId="2BB4DDF7">
+                <wp:simplePos x="0" y="0"/>
+                <wp:positionH relativeFrom="column">
+                  <wp:posOffset>3728720</wp:posOffset>
+                </wp:positionH>
+                <wp:positionV relativeFrom="paragraph">
+                  <wp:posOffset>711200</wp:posOffset>
+                </wp:positionV>
+                <wp:extent cx="1056640" cy="269240"/>
+                <wp:effectExtent l="0" t="0" r="10160" b="16510"/>
+                <wp:wrapNone/>
+                <wp:docPr id="714502611" name="Text Box 7"/>
+                <wp:cNvGraphicFramePr/>
+                <a:graphic xmlns:a="http://schemas.openxmlformats.org/drawingml/2006/main">
+                  <a:graphicData uri="http://schemas.microsoft.com/office/word/2010/wordprocessingShape">
+                    <wps:wsp>
+                      <wps:cNvSpPr txBox="1"/>
+                      <wps:spPr>
+                        <a:xfrm>
+                          <a:off x="0" y="0"/>
+                          <a:ext cx="1056640" cy="269240"/>
+                        </a:xfrm>
+                        <a:prstGeom prst="rect">
+                          <a:avLst/>
+                        </a:prstGeom>
+                        <a:solidFill>
+                          <a:schemeClr val="lt1"/>
+                        </a:solidFill>
+                        <a:ln w="6350">
+                          <a:solidFill>
+                            <a:prstClr val="black"/>
+                          </a:solidFill>
+                        </a:ln>
+                      </wps:spPr>
+                      <wps:txbx>
+                        <w:txbxContent>
+                          <w:p>
+                            <w:pPr>
+                              <w:shd w:val="clear" w:color="auto" w:fill="595959" w:themeFill="text1" w:themeFillTint="A6"/>
+                            </w:pPr>
+                            <w:r>
+                              <w:t>Proto: object</w:t>
+                            </w:r>
+                          </w:p>
+                        </w:txbxContent>
+                      </wps:txbx>
+                      <wps:bodyPr rot="0" spcFirstLastPara="0" vertOverflow="overflow" horzOverflow="overflow" vert="horz" wrap="square" lIns="91440" tIns="45720" rIns="91440" bIns="45720" numCol="1" spcCol="0" rtlCol="0" fromWordArt="0" anchor="t" anchorCtr="0" forceAA="0" compatLnSpc="1">
+                        <a:prstTxWarp prst="textNoShape">
+                          <a:avLst/>
+                        </a:prstTxWarp>
+                        <a:noAutofit/>
+                      </wps:bodyPr>
+                    </wps:wsp>
+                  </a:graphicData>
+                </a:graphic>
+                <wp14:sizeRelH relativeFrom="margin">
+                  <wp14:pctWidth>0</wp14:pctWidth>
+                </wp14:sizeRelH>
+                <wp14:sizeRelV relativeFrom="margin">
+                  <wp14:pctHeight>0</wp14:pctHeight>
+                </wp14:sizeRelV>
+              </wp:anchor>
+            </w:drawing>
+          </mc:Choice>
+          <mc:Fallback>
+            <w:pict>
+              <v:shape w14:anchorId="61E31118" id="Text Box 7" o:spid="_x0000_s1034" type="#_x0000_t202" style="position:absolute;margin-left:293.6pt;margin-top:56pt;width:83.2pt;height:21.2pt;z-index:251698176;visibility:visible;mso-wrap-style:square;mso-width-percent:0;mso-height-percent:0;mso-wrap-distance-left:9pt;mso-wrap-distance-top:0;mso-wrap-distance-right:9pt;mso-wrap-distance-bottom:0;mso-position-horizontal:absolute;mso-position-horizontal-relative:text;mso-position-vertical:absolute;mso-position-vertical-relative:text;mso-width-percent:0;mso-height-percent:0;mso-width-relative:margin;mso-height-relative:margin;v-text-anchor:top" o:gfxdata="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" fillcolor="white [3201]" strokeweight=".5pt">
+                <v:textbox>
+                  <w:txbxContent>
+                    <w:p>
+                      <w:pPr>
+                        <w:shd w:val="clear" w:color="auto" w:fill="595959" w:themeFill="text1" w:themeFillTint="A6"/>
+                      </w:pPr>
+                      <w:r>
+                        <w:t>Proto: object</w:t>
+                      </w:r>
+                    </w:p>
+                  </w:txbxContent>
+                </v:textbox>
+              </v:shape>
+            </w:pict>
+          </mc:Fallback>
+        </mc:AlternateContent>
+      </w:r>
+      <w:r>
+        <w:rPr>
+          <w:noProof/>
+        </w:rPr>
+        <mc:AlternateContent>
+          <mc:Choice Requires="wps">
+            <w:drawing>
+              <wp:anchor distT="0" distB="0" distL="114300" distR="114300" simplePos="0" relativeHeight="251696128" behindDoc="0" locked="0" layoutInCell="1" allowOverlap="1" wp14:anchorId="05A1337C" wp14:editId="2DE8B4A2">
+                <wp:simplePos x="0" y="0"/>
+                <wp:positionH relativeFrom="column">
+                  <wp:posOffset>3637280</wp:posOffset>
+                </wp:positionH>
+                <wp:positionV relativeFrom="paragraph">
+                  <wp:posOffset>640080</wp:posOffset>
+                </wp:positionV>
+                <wp:extent cx="1239520" cy="1971040"/>
+                <wp:effectExtent l="0" t="0" r="17780" b="10160"/>
+                <wp:wrapNone/>
+                <wp:docPr id="1279299298" name="Rectangle 6"/>
+                <wp:cNvGraphicFramePr/>
+                <a:graphic xmlns:a="http://schemas.openxmlformats.org/drawingml/2006/main">
+                  <a:graphicData uri="http://schemas.microsoft.com/office/word/2010/wordprocessingShape">
+                    <wps:wsp>
+                      <wps:cNvSpPr/>
+                      <wps:spPr>
+                        <a:xfrm>
+                          <a:off x="0" y="0"/>
+                          <a:ext cx="1239520" cy="1971040"/>
+                        </a:xfrm>
+                        <a:prstGeom prst="rect">
+                          <a:avLst/>
+                        </a:prstGeom>
+                      </wps:spPr>
+                      <wps:style>
+                        <a:lnRef idx="2">
+                          <a:schemeClr val="accent1">
+                            <a:shade val="15000"/>
+                          </a:schemeClr>
+                        </a:lnRef>
+                        <a:fillRef idx="1">
+                          <a:schemeClr val="accent1"/>
+                        </a:fillRef>
+                        <a:effectRef idx="0">
+                          <a:schemeClr val="accent1"/>
+                        </a:effectRef>
+                        <a:fontRef idx="minor">
+                          <a:schemeClr val="lt1"/>
+                        </a:fontRef>
+                      </wps:style>
+                      <wps:bodyPr rot="0" spcFirstLastPara="0" vertOverflow="overflow" horzOverflow="overflow" vert="horz" wrap="square" lIns="91440" tIns="45720" rIns="91440" bIns="45720" numCol="1" spcCol="0" rtlCol="0" fromWordArt="0" anchor="ctr" anchorCtr="0" forceAA="0" compatLnSpc="1">
+                        <a:prstTxWarp prst="textNoShape">
+                          <a:avLst/>
+                        </a:prstTxWarp>
+                        <a:noAutofit/>
+                      </wps:bodyPr>
+                    </wps:wsp>
+                  </a:graphicData>
+                </a:graphic>
+                <wp14:sizeRelV relativeFrom="margin">
+                  <wp14:pctHeight>0</wp14:pctHeight>
+                </wp14:sizeRelV>
+              </wp:anchor>
+            </w:drawing>
+          </mc:Choice>
+          <mc:Fallback>
+            <w:pict>
+              <v:rect w14:anchorId="5F95059F" id="Rectangle 6" o:spid="_x0000_s1026" style="position:absolute;margin-left:286.4pt;margin-top:50.4pt;width:97.6pt;height:155.2pt;z-index:251696128;visibility:visible;mso-wrap-style:square;mso-height-percent:0;mso-wrap-distance-left:9pt;mso-wrap-distance-top:0;mso-wrap-distance-right:9pt;mso-wrap-distance-bottom:0;mso-position-horizontal:absolute;mso-position-horizontal-relative:text;mso-position-vertical:absolute;mso-position-vertical-relative:text;mso-height-percent:0;mso-height-relative:margin;v-text-anchor:middle" o:gfxdata="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" fillcolor="#156082 [3204]" strokecolor="#030e13 [484]" strokeweight="1.5pt"/>
+            </w:pict>
+          </mc:Fallback>
+        </mc:AlternateContent>
+      </w:r>
+      <w:r>
+        <w:rPr>
+          <w:noProof/>
+        </w:rPr>
+        <mc:AlternateContent>
+          <mc:Choice Requires="wps">
+            <w:drawing>
+              <wp:anchor distT="0" distB="0" distL="114300" distR="114300" simplePos="0" relativeHeight="251694080" behindDoc="0" locked="0" layoutInCell="1" allowOverlap="1" wp14:anchorId="7C9A925C" wp14:editId="40ADB174">
+                <wp:simplePos x="0" y="0"/>
+                <wp:positionH relativeFrom="column">
+                  <wp:posOffset>1076960</wp:posOffset>
+                </wp:positionH>
+                <wp:positionV relativeFrom="paragraph">
+                  <wp:posOffset>-20320</wp:posOffset>
+                </wp:positionV>
+                <wp:extent cx="1854200" cy="858520"/>
+                <wp:effectExtent l="0" t="0" r="69850" b="55880"/>
+                <wp:wrapNone/>
+                <wp:docPr id="583261154" name="Straight Arrow Connector 24"/>
+                <wp:cNvGraphicFramePr/>
+                <a:graphic xmlns:a="http://schemas.openxmlformats.org/drawingml/2006/main">
+                  <a:graphicData uri="http://schemas.microsoft.com/office/word/2010/wordprocessingShape">
+                    <wps:wsp>
+                      <wps:cNvCnPr/>
+                      <wps:spPr>
+                        <a:xfrm>
+                          <a:off x="0" y="0"/>
+                          <a:ext cx="1854200" cy="858520"/>
+                        </a:xfrm>
+                        <a:prstGeom prst="straightConnector1">
+                          <a:avLst/>
+                        </a:prstGeom>
+                        <a:ln>
+                          <a:tailEnd type="triangle"/>
+                        </a:ln>
+                      </wps:spPr>
+                      <wps:style>
+                        <a:lnRef idx="1">
+                          <a:schemeClr val="accent6"/>
+                        </a:lnRef>
+                        <a:fillRef idx="0">
+                          <a:schemeClr val="accent6"/>
+                        </a:fillRef>
+                        <a:effectRef idx="0">
+                          <a:schemeClr val="accent6"/>
+                        </a:effectRef>
+                        <a:fontRef idx="minor">
+                          <a:schemeClr val="tx1"/>
+                        </a:fontRef>
+                      </wps:style>
+                      <wps:bodyPr/>
+                    </wps:wsp>
+                  </a:graphicData>
+                </a:graphic>
+              </wp:anchor>
+            </w:drawing>
+          </mc:Choice>
+          <mc:Fallback>
+            <w:pict>
+              <v:shape w14:anchorId="0DCF4F3C" id="Straight Arrow Connector 24" o:spid="_x0000_s1026" type="#_x0000_t32" style="position:absolute;margin-left:84.8pt;margin-top:-1.6pt;width:146pt;height:67.6pt;z-index:251694080;visibility:visible;mso-wrap-style:square;mso-wrap-distance-left:9pt;mso-wrap-distance-top:0;mso-wrap-distance-right:9pt;mso-wrap-distance-bottom:0;mso-position-horizontal:absolute;mso-position-horizontal-relative:text;mso-position-vertical:absolute;mso-position-vertical-relative:text" o:gfxdata="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" strokecolor="#4ea72e [3209]" strokeweight="1pt">
+                <v:stroke endarrow="block" joinstyle="miter"/>
+              </v:shape>
+            </w:pict>
+          </mc:Fallback>
+        </mc:AlternateContent>
+      </w:r>
+      <w:r>
+        <w:rPr>
+          <w:noProof/>
+        </w:rPr>
+        <mc:AlternateContent>
+          <mc:Choice Requires="wps">
+            <w:drawing>
+              <wp:anchor distT="0" distB="0" distL="114300" distR="114300" simplePos="0" relativeHeight="251693056" behindDoc="0" locked="0" layoutInCell="1" allowOverlap="1" wp14:anchorId="1A65040F" wp14:editId="605DF878">
+                <wp:simplePos x="0" y="0"/>
+                <wp:positionH relativeFrom="column">
+                  <wp:posOffset>203200</wp:posOffset>
+                </wp:positionH>
+                <wp:positionV relativeFrom="paragraph">
+                  <wp:posOffset>-177800</wp:posOffset>
+                </wp:positionV>
+                <wp:extent cx="863600" cy="381000"/>
+                <wp:effectExtent l="0" t="0" r="12700" b="19050"/>
+                <wp:wrapNone/>
+                <wp:docPr id="1029149556" name="Text Box 23"/>
+                <wp:cNvGraphicFramePr/>
+                <a:graphic xmlns:a="http://schemas.openxmlformats.org/drawingml/2006/main">
+                  <a:graphicData uri="http://schemas.microsoft.com/office/word/2010/wordprocessingShape">
+                    <wps:wsp>
+                      <wps:cNvSpPr txBox="1"/>
+                      <wps:spPr>
+                        <a:xfrm>
+                          <a:off x="0" y="0"/>
+                          <a:ext cx="863600" cy="381000"/>
+                        </a:xfrm>
+                        <a:prstGeom prst="rect">
+                          <a:avLst/>
+                        </a:prstGeom>
+                        <a:solidFill>
+                          <a:schemeClr val="lt1"/>
+                        </a:solidFill>
+                        <a:ln w="6350">
+                          <a:solidFill>
+                            <a:prstClr val="black"/>
+                          </a:solidFill>
+                        </a:ln>
+                      </wps:spPr>
+                      <wps:txbx>
+                        <w:txbxContent>
+                          <w:p/>
+                        </w:txbxContent>
+                      </wps:txbx>
+                      <wps:bodyPr rot="0" spcFirstLastPara="0" vertOverflow="overflow" horzOverflow="overflow" vert="horz" wrap="square" lIns="91440" tIns="45720" rIns="91440" bIns="45720" numCol="1" spcCol="0" rtlCol="0" fromWordArt="0" anchor="t" anchorCtr="0" forceAA="0" compatLnSpc="1">
+                        <a:prstTxWarp prst="textNoShape">
+                          <a:avLst/>
+                        </a:prstTxWarp>
+                        <a:noAutofit/>
+                      </wps:bodyPr>
+                    </wps:wsp>
+                  </a:graphicData>
+                </a:graphic>
+              </wp:anchor>
+            </w:drawing>
+          </mc:Choice>
+          <mc:Fallback>
+            <w:pict>
+              <v:shape w14:anchorId="1A65040F" id="_x0000_s1035" type="#_x0000_t202" style="position:absolute;margin-left:16pt;margin-top:-14pt;width:68pt;height:30pt;z-index:251693056;visibility:visible;mso-wrap-style:square;mso-wrap-distance-left:9pt;mso-wrap-distance-top:0;mso-wrap-distance-right:9pt;mso-wrap-distance-bottom:0;mso-position-horizontal:absolute;mso-position-horizontal-relative:text;mso-position-vertical:absolute;mso-position-vertical-relative:text;v-text-anchor:top" o:gfxdata="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" fillcolor="white [3201]" strokeweight=".5pt">
+                <v:textbox>
+                  <w:txbxContent>
+                    <w:p/>
+                  </w:txbxContent>
+                </v:textbox>
+              </v:shape>
+            </w:pict>
+          </mc:Fallback>
+        </mc:AlternateContent>
+      </w:r>
+      <w:r>
+        <w:rPr>
+          <w:noProof/>
+        </w:rPr>
+        <mc:AlternateContent>
+          <mc:Choice Requires="wps">
+            <w:drawing>
+              <wp:anchor distT="0" distB="0" distL="114300" distR="114300" simplePos="0" relativeHeight="251676672" behindDoc="0" locked="0" layoutInCell="1" allowOverlap="1" wp14:anchorId="7F730DB8" wp14:editId="1352445B">
+                <wp:simplePos x="0" y="0"/>
+                <wp:positionH relativeFrom="column">
+                  <wp:posOffset>4018280</wp:posOffset>
+                </wp:positionH>
+                <wp:positionV relativeFrom="paragraph">
+                  <wp:posOffset>1005840</wp:posOffset>
+                </wp:positionV>
+                <wp:extent cx="975360" cy="1330960"/>
+                <wp:effectExtent l="0" t="38100" r="53340" b="21590"/>
+                <wp:wrapNone/>
+                <wp:docPr id="464401916" name="Straight Arrow Connector 12"/>
+                <wp:cNvGraphicFramePr/>
+                <a:graphic xmlns:a="http://schemas.openxmlformats.org/drawingml/2006/main">
+                  <a:graphicData uri="http://schemas.microsoft.com/office/word/2010/wordprocessingShape">
+                    <wps:wsp>
+                      <wps:cNvCnPr/>
+                      <wps:spPr>
+                        <a:xfrm flipV="1">
+                          <a:off x="0" y="0"/>
+                          <a:ext cx="975360" cy="1330960"/>
+                        </a:xfrm>
+                        <a:prstGeom prst="straightConnector1">
+                          <a:avLst/>
+                        </a:prstGeom>
+                        <a:ln>
+                          <a:tailEnd type="triangle"/>
+                        </a:ln>
+                      </wps:spPr>
+                      <wps:style>
+                        <a:lnRef idx="1">
+                          <a:schemeClr val="accent6"/>
+                        </a:lnRef>
+                        <a:fillRef idx="0">
+                          <a:schemeClr val="accent6"/>
+                        </a:fillRef>
+                        <a:effectRef idx="0">
+                          <a:schemeClr val="accent6"/>
+                        </a:effectRef>
+                        <a:fontRef idx="minor">
+                          <a:schemeClr val="tx1"/>
+                        </a:fontRef>
+                      </wps:style>
+                      <wps:bodyPr/>
+                    </wps:wsp>
+                  </a:graphicData>
+                </a:graphic>
+                <wp14:sizeRelH relativeFrom="margin">
+                  <wp14:pctWidth>0</wp14:pctWidth>
+                </wp14:sizeRelH>
+                <wp14:sizeRelV relativeFrom="margin">
+                  <wp14:pctHeight>0</wp14:pctHeight>
+                </wp14:sizeRelV>
+              </wp:anchor>
+            </w:drawing>
+          </mc:Choice>
+          <mc:Fallback>
+            <w:pict>
+              <v:shape w14:anchorId="42655A8F" id="Straight Arrow Connector 12" o:spid="_x0000_s1026" type="#_x0000_t32" style="position:absolute;margin-left:316.4pt;margin-top:79.2pt;width:76.8pt;height:104.8pt;flip:y;z-index:251676672;visibility:visible;mso-wrap-style:square;mso-width-percent:0;mso-height-percent:0;mso-wrap-distance-left:9pt;mso-wrap-distance-top:0;mso-wrap-distance-right:9pt;mso-wrap-distance-bottom:0;mso-position-horizontal:absolute;mso-position-horizontal-relative:text;mso-position-vertical:absolute;mso-position-vertical-relative:text;mso-width-percent:0;mso-height-percent:0;mso-width-relative:margin;mso-height-relative:margin" o:gfxdata="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" strokecolor="#4ea72e [3209]" strokeweight="1pt">
+                <v:stroke endarrow="block" joinstyle="miter"/>
+              </v:shape>
+            </w:pict>
+          </mc:Fallback>
+        </mc:AlternateContent>
+      </w:r>
+      <w:r>
+        <w:rPr>
+          <w:noProof/>
+        </w:rPr>
+        <mc:AlternateContent>
+          <mc:Choice Requires="wps">
+            <w:drawing>
+              <wp:anchor distT="0" distB="0" distL="114300" distR="114300" simplePos="0" relativeHeight="251692032" behindDoc="0" locked="0" layoutInCell="1" allowOverlap="1" wp14:anchorId="2FBC0E24" wp14:editId="1C3F0942">
+                <wp:simplePos x="0" y="0"/>
+                <wp:positionH relativeFrom="column">
+                  <wp:posOffset>5008880</wp:posOffset>
+                </wp:positionH>
+                <wp:positionV relativeFrom="paragraph">
+                  <wp:posOffset>828040</wp:posOffset>
+                </wp:positionV>
+                <wp:extent cx="817880" cy="360680"/>
+                <wp:effectExtent l="0" t="0" r="20320" b="20320"/>
+                <wp:wrapNone/>
+                <wp:docPr id="397274080" name="Rectangle 11"/>
+                <wp:cNvGraphicFramePr/>
+                <a:graphic xmlns:a="http://schemas.openxmlformats.org/drawingml/2006/main">
+                  <a:graphicData uri="http://schemas.microsoft.com/office/word/2010/wordprocessingShape">
+                    <wps:wsp>
+                      <wps:cNvSpPr/>
+                      <wps:spPr>
+                        <a:xfrm>
+                          <a:off x="0" y="0"/>
+                          <a:ext cx="817880" cy="360680"/>
+                        </a:xfrm>
+                        <a:prstGeom prst="rect">
+                          <a:avLst/>
+                        </a:prstGeom>
+                      </wps:spPr>
+                      <wps:style>
+                        <a:lnRef idx="2">
+                          <a:schemeClr val="accent1">
+                            <a:shade val="15000"/>
+                          </a:schemeClr>
+                        </a:lnRef>
+                        <a:fillRef idx="1">
+                          <a:schemeClr val="accent1"/>
+                        </a:fillRef>
+                        <a:effectRef idx="0">
+                          <a:schemeClr val="accent1"/>
+                        </a:effectRef>
+                        <a:fontRef idx="minor">
+                          <a:schemeClr val="lt1"/>
+                        </a:fontRef>
+                      </wps:style>
+                      <wps:bodyPr rot="0" spcFirstLastPara="0" vertOverflow="overflow" horzOverflow="overflow" vert="horz" wrap="square" lIns="91440" tIns="45720" rIns="91440" bIns="45720" numCol="1" spcCol="0" rtlCol="0" fromWordArt="0" anchor="ctr" anchorCtr="0" forceAA="0" compatLnSpc="1">
+                        <a:prstTxWarp prst="textNoShape">
+                          <a:avLst/>
+                        </a:prstTxWarp>
+                        <a:noAutofit/>
+                      </wps:bodyPr>
+                    </wps:wsp>
+                  </a:graphicData>
+                </a:graphic>
+              </wp:anchor>
+            </w:drawing>
+          </mc:Choice>
+          <mc:Fallback>
+            <w:pict>
+              <v:rect w14:anchorId="6C4F665D" id="Rectangle 11" o:spid="_x0000_s1026" style="position:absolute;margin-left:394.4pt;margin-top:65.2pt;width:64.4pt;height:28.4pt;z-index:251692032;visibility:visible;mso-wrap-style:square;mso-wrap-distance-left:9pt;mso-wrap-distance-top:0;mso-wrap-distance-right:9pt;mso-wrap-distance-bottom:0;mso-position-horizontal:absolute;mso-position-horizontal-relative:text;mso-position-vertical:absolute;mso-position-vertical-relative:text;v-text-anchor:middle" o:gfxdata="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" fillcolor="#156082 [3204]" strokecolor="#030e13 [484]" strokeweight="1.5pt"/>
+            </w:pict>
+          </mc:Fallback>
+        </mc:AlternateContent>
+      </w:r>
+      <w:r>
+        <w:rPr>
+          <w:noProof/>
+        </w:rPr>
+        <mc:AlternateContent>
+          <mc:Choice Requires="wps">
+            <w:drawing>
+              <wp:anchor distT="0" distB="0" distL="114300" distR="114300" simplePos="0" relativeHeight="251689984" behindDoc="0" locked="0" layoutInCell="1" allowOverlap="1" wp14:anchorId="48ADBA32" wp14:editId="13AD81D5">
+                <wp:simplePos x="0" y="0"/>
+                <wp:positionH relativeFrom="column">
+                  <wp:posOffset>3007360</wp:posOffset>
+                </wp:positionH>
+                <wp:positionV relativeFrom="paragraph">
+                  <wp:posOffset>2087880</wp:posOffset>
+                </wp:positionV>
+                <wp:extent cx="1000760" cy="254000"/>
+                <wp:effectExtent l="0" t="0" r="27940" b="12700"/>
+                <wp:wrapNone/>
+                <wp:docPr id="119699617" name="Text Box 9"/>
+                <wp:cNvGraphicFramePr/>
+                <a:graphic xmlns:a="http://schemas.openxmlformats.org/drawingml/2006/main">
+                  <a:graphicData uri="http://schemas.microsoft.com/office/word/2010/wordprocessingShape">
+                    <wps:wsp>
+                      <wps:cNvSpPr txBox="1"/>
+                      <wps:spPr>
+                        <a:xfrm>
+                          <a:off x="0" y="0"/>
+                          <a:ext cx="1000760" cy="254000"/>
+                        </a:xfrm>
+                        <a:prstGeom prst="rect">
+                          <a:avLst/>
+                        </a:prstGeom>
+                        <a:solidFill>
+                          <a:schemeClr val="lt1"/>
+                        </a:solidFill>
+                        <a:ln w="6350">
+                          <a:solidFill>
+                            <a:prstClr val="black"/>
+                          </a:solidFill>
+                        </a:ln>
+                      </wps:spPr>
+                      <wps:txbx>
+                        <w:txbxContent>
+                          <w:p>
+                            <w:r>
+                              <w:t>JavaScript</w:t>
+                            </w:r>
+                          </w:p>
+                        </w:txbxContent>
+                      </wps:txbx>
+                      <wps:bodyPr rot="0" spcFirstLastPara="0" vertOverflow="overflow" horzOverflow="overflow" vert="horz" wrap="square" lIns="91440" tIns="45720" rIns="91440" bIns="45720" numCol="1" spcCol="0" rtlCol="0" fromWordArt="0" anchor="t" anchorCtr="0" forceAA="0" compatLnSpc="1">
+                        <a:prstTxWarp prst="textNoShape">
+                          <a:avLst/>
+                        </a:prstTxWarp>
+                        <a:noAutofit/>
+                      </wps:bodyPr>
+                    </wps:wsp>
+                  </a:graphicData>
+                </a:graphic>
+              </wp:anchor>
+            </w:drawing>
+          </mc:Choice>
+          <mc:Fallback>
+            <w:pict>
+              <v:shape w14:anchorId="48ADBA32" id="_x0000_s1036" type="#_x0000_t202" style="position:absolute;margin-left:236.8pt;margin-top:164.4pt;width:78.8pt;height:20pt;z-index:251689984;visibility:visible;mso-wrap-style:square;mso-wrap-distance-left:9pt;mso-wrap-distance-top:0;mso-wrap-distance-right:9pt;mso-wrap-distance-bottom:0;mso-position-horizontal:absolute;mso-position-horizontal-relative:text;mso-position-vertical:absolute;mso-position-vertical-relative:text;v-text-anchor:top" o:gfxdata="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" fillcolor="white [3201]" strokeweight=".5pt">
+                <v:textbox>
+                  <w:txbxContent>
+                    <w:p>
+                      <w:r>
+                        <w:t>JavaScript</w:t>
+                      </w:r>
+                    </w:p>
+                  </w:txbxContent>
+                </v:textbox>
+              </v:shape>
+            </w:pict>
+          </mc:Fallback>
+        </mc:AlternateContent>
+      </w:r>
+      <w:r>
+        <w:rPr>
+          <w:noProof/>
+        </w:rPr>
+        <mc:AlternateContent>
+          <mc:Choice Requires="wps">
+            <w:drawing>
+              <wp:anchor distT="0" distB="0" distL="114300" distR="114300" simplePos="0" relativeHeight="251673600" behindDoc="0" locked="0" layoutInCell="1" allowOverlap="1" wp14:anchorId="00FC02AE" wp14:editId="4FD3A7C0">
+                <wp:simplePos x="0" y="0"/>
+                <wp:positionH relativeFrom="column">
+                  <wp:posOffset>3032760</wp:posOffset>
+                </wp:positionH>
+                <wp:positionV relativeFrom="paragraph">
+                  <wp:posOffset>2377440</wp:posOffset>
+                </wp:positionV>
+                <wp:extent cx="1000760" cy="254000"/>
+                <wp:effectExtent l="0" t="0" r="27940" b="12700"/>
+                <wp:wrapNone/>
+                <wp:docPr id="2067502406" name="Text Box 9"/>
+                <wp:cNvGraphicFramePr/>
+                <a:graphic xmlns:a="http://schemas.openxmlformats.org/drawingml/2006/main">
+                  <a:graphicData uri="http://schemas.microsoft.com/office/word/2010/wordprocessingShape">
+                    <wps:wsp>
+                      <wps:cNvSpPr txBox="1"/>
+                      <wps:spPr>
+                        <a:xfrm>
+                          <a:off x="0" y="0"/>
+                          <a:ext cx="1000760" cy="254000"/>
+                        </a:xfrm>
+                        <a:prstGeom prst="rect">
+                          <a:avLst/>
+                        </a:prstGeom>
+                        <a:solidFill>
+                          <a:schemeClr val="lt1"/>
+                        </a:solidFill>
+                        <a:ln w="6350">
+                          <a:solidFill>
+                            <a:prstClr val="black"/>
+                          </a:solidFill>
+                        </a:ln>
+                      </wps:spPr>
+                      <wps:txbx>
+                        <w:txbxContent>
+                          <w:p/>
+                        </w:txbxContent>
+                      </wps:txbx>
+                      <wps:bodyPr rot="0" spcFirstLastPara="0" vertOverflow="overflow" horzOverflow="overflow" vert="horz" wrap="square" lIns="91440" tIns="45720" rIns="91440" bIns="45720" numCol="1" spcCol="0" rtlCol="0" fromWordArt="0" anchor="t" anchorCtr="0" forceAA="0" compatLnSpc="1">
+                        <a:prstTxWarp prst="textNoShape">
+                          <a:avLst/>
+                        </a:prstTxWarp>
+                        <a:noAutofit/>
+                      </wps:bodyPr>
+                    </wps:wsp>
+                  </a:graphicData>
+                </a:graphic>
+              </wp:anchor>
+            </w:drawing>
+          </mc:Choice>
+          <mc:Fallback>
+            <w:pict>
+              <v:shape w14:anchorId="00FC02AE" id="_x0000_s1037" type="#_x0000_t202" style="position:absolute;margin-left:238.8pt;margin-top:187.2pt;width:78.8pt;height:20pt;z-index:251673600;visibility:visible;mso-wrap-style:square;mso-wrap-distance-left:9pt;mso-wrap-distance-top:0;mso-wrap-distance-right:9pt;mso-wrap-distance-bottom:0;mso-position-horizontal:absolute;mso-position-horizontal-relative:text;mso-position-vertical:absolute;mso-position-vertical-relative:text;v-text-anchor:top" o:gfxdata="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" fillcolor="white [3201]" strokeweight=".5pt">
+                <v:textbox>
+                  <w:txbxContent>
+                    <w:p/>
+                  </w:txbxContent>
+                </v:textbox>
+              </v:shape>
+            </w:pict>
+          </mc:Fallback>
+        </mc:AlternateContent>
+      </w:r>
+      <w:r>
+        <w:rPr>
+          <w:noProof/>
+        </w:rPr>
+        <mc:AlternateContent>
+          <mc:Choice Requires="wps">
+            <w:drawing>
+              <wp:anchor distT="0" distB="0" distL="114300" distR="114300" simplePos="0" relativeHeight="251664384" behindDoc="0" locked="0" layoutInCell="1" allowOverlap="1" wp14:anchorId="382144D3" wp14:editId="79855AFF">
+                <wp:simplePos x="0" y="0"/>
+                <wp:positionH relativeFrom="column">
+                  <wp:posOffset>2875280</wp:posOffset>
+                </wp:positionH>
+                <wp:positionV relativeFrom="paragraph">
+                  <wp:posOffset>828040</wp:posOffset>
+                </wp:positionV>
+                <wp:extent cx="1239520" cy="1889760"/>
+                <wp:effectExtent l="0" t="0" r="17780" b="15240"/>
+                <wp:wrapNone/>
+                <wp:docPr id="96206858" name="Rectangle 6"/>
+                <wp:cNvGraphicFramePr/>
+                <a:graphic xmlns:a="http://schemas.openxmlformats.org/drawingml/2006/main">
+                  <a:graphicData uri="http://schemas.microsoft.com/office/word/2010/wordprocessingShape">
+                    <wps:wsp>
+                      <wps:cNvSpPr/>
+                      <wps:spPr>
+                        <a:xfrm>
+                          <a:off x="0" y="0"/>
+                          <a:ext cx="1239520" cy="1889760"/>
+                        </a:xfrm>
+                        <a:prstGeom prst="rect">
+                          <a:avLst/>
+                        </a:prstGeom>
+                      </wps:spPr>
+                      <wps:style>
+                        <a:lnRef idx="2">
+                          <a:schemeClr val="accent1">
+                            <a:shade val="15000"/>
+                          </a:schemeClr>
+                        </a:lnRef>
+                        <a:fillRef idx="1">
+                          <a:schemeClr val="accent1"/>
+                        </a:fillRef>
+                        <a:effectRef idx="0">
+                          <a:schemeClr val="accent1"/>
+                        </a:effectRef>
+                        <a:fontRef idx="minor">
+                          <a:schemeClr val="lt1"/>
+                        </a:fontRef>
+                      </wps:style>
+                      <wps:bodyPr rot="0" spcFirstLastPara="0" vertOverflow="overflow" horzOverflow="overflow" vert="horz" wrap="square" lIns="91440" tIns="45720" rIns="91440" bIns="45720" numCol="1" spcCol="0" rtlCol="0" fromWordArt="0" anchor="ctr" anchorCtr="0" forceAA="0" compatLnSpc="1">
+                        <a:prstTxWarp prst="textNoShape">
+                          <a:avLst/>
+                        </a:prstTxWarp>
+                        <a:noAutofit/>
+                      </wps:bodyPr>
+                    </wps:wsp>
+                  </a:graphicData>
+                </a:graphic>
+                <wp14:sizeRelV relativeFrom="margin">
+                  <wp14:pctHeight>0</wp14:pctHeight>
+                </wp14:sizeRelV>
+              </wp:anchor>
+            </w:drawing>
+          </mc:Choice>
+          <mc:Fallback>
+            <w:pict>
+              <v:rect w14:anchorId="481A0E59" id="Rectangle 6" o:spid="_x0000_s1026" style="position:absolute;margin-left:226.4pt;margin-top:65.2pt;width:97.6pt;height:148.8pt;z-index:251664384;visibility:visible;mso-wrap-style:square;mso-height-percent:0;mso-wrap-distance-left:9pt;mso-wrap-distance-top:0;mso-wrap-distance-right:9pt;mso-wrap-distance-bottom:0;mso-position-horizontal:absolute;mso-position-horizontal-relative:text;mso-position-vertical:absolute;mso-position-vertical-relative:text;mso-height-percent:0;mso-height-relative:margin;v-text-anchor:middle" o:gfxdata="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" fillcolor="#156082 [3204]" strokecolor="#030e13 [484]" strokeweight="1.5pt"/>
+            </w:pict>
+          </mc:Fallback>
+        </mc:AlternateContent>
+      </w:r>
+      <w:r>
+        <w:rPr>
+          <w:noProof/>
+        </w:rPr>
+        <mc:AlternateContent>
+          <mc:Choice Requires="wps">
+            <w:drawing>
+              <wp:anchor distT="0" distB="0" distL="114300" distR="114300" simplePos="0" relativeHeight="251687936" behindDoc="0" locked="0" layoutInCell="1" allowOverlap="1" wp14:anchorId="60D89D9F" wp14:editId="719F5C0A">
+                <wp:simplePos x="0" y="0"/>
+                <wp:positionH relativeFrom="column">
+                  <wp:posOffset>2997200</wp:posOffset>
+                </wp:positionH>
+                <wp:positionV relativeFrom="paragraph">
+                  <wp:posOffset>1803400</wp:posOffset>
+                </wp:positionV>
+                <wp:extent cx="1000760" cy="254000"/>
+                <wp:effectExtent l="0" t="0" r="27940" b="12700"/>
+                <wp:wrapNone/>
+                <wp:docPr id="759729431" name="Text Box 9"/>
+                <wp:cNvGraphicFramePr/>
+                <a:graphic xmlns:a="http://schemas.openxmlformats.org/drawingml/2006/main">
+                  <a:graphicData uri="http://schemas.microsoft.com/office/word/2010/wordprocessingShape">
+                    <wps:wsp>
+                      <wps:cNvSpPr txBox="1"/>
+                      <wps:spPr>
+                        <a:xfrm>
+                          <a:off x="0" y="0"/>
+                          <a:ext cx="1000760" cy="254000"/>
+                        </a:xfrm>
+                        <a:prstGeom prst="rect">
+                          <a:avLst/>
+                        </a:prstGeom>
+                        <a:solidFill>
+                          <a:schemeClr val="lt1"/>
+                        </a:solidFill>
+                        <a:ln w="6350">
+                          <a:solidFill>
+                            <a:prstClr val="black"/>
+                          </a:solidFill>
+                        </a:ln>
+                      </wps:spPr>
+                      <wps:txbx>
+                        <w:txbxContent>
+                          <w:p>
+                            <w:r>
+                              <w:t>JavaScript</w:t>
+                            </w:r>
+                          </w:p>
+                        </w:txbxContent>
+                      </wps:txbx>
+                      <wps:bodyPr rot="0" spcFirstLastPara="0" vertOverflow="overflow" horzOverflow="overflow" vert="horz" wrap="square" lIns="91440" tIns="45720" rIns="91440" bIns="45720" numCol="1" spcCol="0" rtlCol="0" fromWordArt="0" anchor="t" anchorCtr="0" forceAA="0" compatLnSpc="1">
+                        <a:prstTxWarp prst="textNoShape">
+                          <a:avLst/>
+                        </a:prstTxWarp>
+                        <a:noAutofit/>
+                      </wps:bodyPr>
+                    </wps:wsp>
+                  </a:graphicData>
+                </a:graphic>
+              </wp:anchor>
+            </w:drawing>
+          </mc:Choice>
+          <mc:Fallback>
+            <w:pict>
+              <v:shape w14:anchorId="60D89D9F" id="_x0000_s1038" type="#_x0000_t202" style="position:absolute;margin-left:236pt;margin-top:142pt;width:78.8pt;height:20pt;z-index:251687936;visibility:visible;mso-wrap-style:square;mso-wrap-distance-left:9pt;mso-wrap-distance-top:0;mso-wrap-distance-right:9pt;mso-wrap-distance-bottom:0;mso-position-horizontal:absolute;mso-position-horizontal-relative:text;mso-position-vertical:absolute;mso-position-vertical-relative:text;v-text-anchor:top" o:gfxdata="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" fillcolor="white [3201]" strokeweight=".5pt">
+                <v:textbox>
+                  <w:txbxContent>
+                    <w:p>
+                      <w:r>
+                        <w:t>JavaScript</w:t>
+                      </w:r>
+                    </w:p>
+                  </w:txbxContent>
+                </v:textbox>
+              </v:shape>
+            </w:pict>
+          </mc:Fallback>
+        </mc:AlternateContent>
+      </w:r>
+      <w:r>
+        <w:rPr>
+          <w:noProof/>
+        </w:rPr>
+        <mc:AlternateContent>
+          <mc:Choice Requires="wps">
+            <w:drawing>
+              <wp:anchor distT="0" distB="0" distL="114300" distR="114300" simplePos="0" relativeHeight="251685888" behindDoc="0" locked="0" layoutInCell="1" allowOverlap="1" wp14:anchorId="52D6C269" wp14:editId="74FA299E">
+                <wp:simplePos x="0" y="0"/>
+                <wp:positionH relativeFrom="column">
+                  <wp:posOffset>3002280</wp:posOffset>
+                </wp:positionH>
+                <wp:positionV relativeFrom="paragraph">
+                  <wp:posOffset>1529080</wp:posOffset>
+                </wp:positionV>
+                <wp:extent cx="1000760" cy="254000"/>
+                <wp:effectExtent l="0" t="0" r="27940" b="12700"/>
+                <wp:wrapNone/>
+                <wp:docPr id="1651682917" name="Text Box 9"/>
+                <wp:cNvGraphicFramePr/>
+                <a:graphic xmlns:a="http://schemas.openxmlformats.org/drawingml/2006/main">
+                  <a:graphicData uri="http://schemas.microsoft.com/office/word/2010/wordprocessingShape">
+                    <wps:wsp>
+                      <wps:cNvSpPr txBox="1"/>
+                      <wps:spPr>
+                        <a:xfrm>
+                          <a:off x="0" y="0"/>
+                          <a:ext cx="1000760" cy="254000"/>
+                        </a:xfrm>
+                        <a:prstGeom prst="rect">
+                          <a:avLst/>
+                        </a:prstGeom>
+                        <a:solidFill>
+                          <a:schemeClr val="lt1"/>
+                        </a:solidFill>
+                        <a:ln w="6350">
+                          <a:solidFill>
+                            <a:prstClr val="black"/>
+                          </a:solidFill>
+                        </a:ln>
+                      </wps:spPr>
+                      <wps:txbx>
+                        <w:txbxContent>
+                          <w:p>
+                            <w:r>
+                              <w:t>JavaScript</w:t>
+                            </w:r>
+                          </w:p>
+                        </w:txbxContent>
+                      </wps:txbx>
+                      <wps:bodyPr rot="0" spcFirstLastPara="0" vertOverflow="overflow" horzOverflow="overflow" vert="horz" wrap="square" lIns="91440" tIns="45720" rIns="91440" bIns="45720" numCol="1" spcCol="0" rtlCol="0" fromWordArt="0" anchor="t" anchorCtr="0" forceAA="0" compatLnSpc="1">
+                        <a:prstTxWarp prst="textNoShape">
+                          <a:avLst/>
+                        </a:prstTxWarp>
+                        <a:noAutofit/>
+                      </wps:bodyPr>
+                    </wps:wsp>
+                  </a:graphicData>
+                </a:graphic>
+              </wp:anchor>
+            </w:drawing>
+          </mc:Choice>
+          <mc:Fallback>
+            <w:pict>
+              <v:shape w14:anchorId="52D6C269" id="_x0000_s1039" type="#_x0000_t202" style="position:absolute;margin-left:236.4pt;margin-top:120.4pt;width:78.8pt;height:20pt;z-index:251685888;visibility:visible;mso-wrap-style:square;mso-wrap-distance-left:9pt;mso-wrap-distance-top:0;mso-wrap-distance-right:9pt;mso-wrap-distance-bottom:0;mso-position-horizontal:absolute;mso-position-horizontal-relative:text;mso-position-vertical:absolute;mso-position-vertical-relative:text;v-text-anchor:top" o:gfxdata="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" fillcolor="white [3201]" strokeweight=".5pt">
+                <v:textbox>
+                  <w:txbxContent>
+                    <w:p>
+                      <w:r>
+                        <w:t>JavaScript</w:t>
+                      </w:r>
+                    </w:p>
+                  </w:txbxContent>
+                </v:textbox>
+              </v:shape>
+            </w:pict>
+          </mc:Fallback>
+        </mc:AlternateContent>
+      </w:r>
+      <w:r>
+        <w:rPr>
+          <w:noProof/>
+        </w:rPr>
+        <mc:AlternateContent>
+          <mc:Choice Requires="wps">
+            <w:drawing>
+              <wp:anchor distT="0" distB="0" distL="114300" distR="114300" simplePos="0" relativeHeight="251659264" behindDoc="0" locked="0" layoutInCell="1" allowOverlap="1" wp14:anchorId="0DC6EAC3" wp14:editId="00E81E2E">
+                <wp:simplePos x="0" y="0"/>
+                <wp:positionH relativeFrom="column">
+                  <wp:posOffset>-289560</wp:posOffset>
+                </wp:positionH>
+                <wp:positionV relativeFrom="paragraph">
+                  <wp:posOffset>-416560</wp:posOffset>
+                </wp:positionV>
+                <wp:extent cx="6624320" cy="3942080"/>
+                <wp:effectExtent l="0" t="0" r="24130" b="20320"/>
+                <wp:wrapNone/>
+                <wp:docPr id="190388641" name="Rectangle 1"/>
+                <wp:cNvGraphicFramePr/>
+                <a:graphic xmlns:a="http://schemas.openxmlformats.org/drawingml/2006/main">
+                  <a:graphicData uri="http://schemas.microsoft.com/office/word/2010/wordprocessingShape">
+                    <wps:wsp>
+                      <wps:cNvSpPr/>
+                      <wps:spPr>
+                        <a:xfrm>
+                          <a:off x="0" y="0"/>
+                          <a:ext cx="6624320" cy="3942080"/>
+                        </a:xfrm>
+                        <a:prstGeom prst="rect">
+                          <a:avLst/>
+                        </a:prstGeom>
+                      </wps:spPr>
+                      <wps:style>
+                        <a:lnRef idx="2">
+                          <a:schemeClr val="accent1">
+                            <a:shade val="15000"/>
+                          </a:schemeClr>
+                        </a:lnRef>
+                        <a:fillRef idx="1">
+                          <a:schemeClr val="accent1"/>
+                        </a:fillRef>
+                        <a:effectRef idx="0">
+                          <a:schemeClr val="accent1"/>
+                        </a:effectRef>
+                        <a:fontRef idx="minor">
+                          <a:schemeClr val="lt1"/>
+                        </a:fontRef>
+                      </wps:style>
+                      <wps:bodyPr rot="0" spcFirstLastPara="0" vertOverflow="overflow" horzOverflow="overflow" vert="horz" wrap="square" lIns="91440" tIns="45720" rIns="91440" bIns="45720" numCol="1" spcCol="0" rtlCol="0" fromWordArt="0" anchor="ctr" anchorCtr="0" forceAA="0" compatLnSpc="1">
+                        <a:prstTxWarp prst="textNoShape">
+                          <a:avLst/>
+                        </a:prstTxWarp>
+                        <a:noAutofit/>
+                      </wps:bodyPr>
+                    </wps:wsp>
+                  </a:graphicData>
+                </a:graphic>
+                <wp14:sizeRelH relativeFrom="margin">
+                  <wp14:pctWidth>0</wp14:pctWidth>
+                </wp14:sizeRelH>
+                <wp14:sizeRelV relativeFrom="margin">
+                  <wp14:pctHeight>0</wp14:pctHeight>
+                </wp14:sizeRelV>
+              </wp:anchor>
+            </w:drawing>
+          </mc:Choice>
+          <mc:Fallback>
+            <w:pict>
+              <v:rect w14:anchorId="0111DD96" id="Rectangle 1" o:spid="_x0000_s1026" style="position:absolute;margin-left:-22.8pt;margin-top:-32.8pt;width:521.6pt;height:310.4pt;z-index:251659264;visibility:visible;mso-wrap-style:square;mso-width-percent:0;mso-height-percent:0;mso-wrap-distance-left:9pt;mso-wrap-distance-top:0;mso-wrap-distance-right:9pt;mso-wrap-distance-bottom:0;mso-position-horizontal:absolute;mso-position-horizontal-relative:text;mso-position-vertical:absolute;mso-position-vertical-relative:text;mso-width-percent:0;mso-height-percent:0;mso-width-relative:margin;mso-height-relative:margin;v-text-anchor:middle" o:gfxdata="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" fillcolor="#156082 [3204]" strokecolor="#030e13 [484]" strokeweight="1.5pt"/>
+            </w:pict>
+          </mc:Fallback>
+        </mc:AlternateContent>
+      </w:r>
       <w:r>
         <w:rPr>
           <w:noProof/>
@@ -80,7 +1840,7 @@
         <mc:AlternateContent>
           <mc:Choice Requires="wps">
             <w:drawing>
-              <wp:anchor distT="0" distB="0" distL="114300" distR="114300" simplePos="0" relativeHeight="251677696" behindDoc="0" locked="0" layoutInCell="1" allowOverlap="1" wp14:anchorId="326EBB79" wp14:editId="56B152D2">
+              <wp:anchor distT="0" distB="0" distL="114300" distR="114300" simplePos="0" relativeHeight="251677696" behindDoc="0" locked="0" layoutInCell="1" allowOverlap="1" wp14:anchorId="326EBB79" wp14:editId="2CBA8EA4">
                 <wp:simplePos x="0" y="0"/>
                 <wp:positionH relativeFrom="column">
                   <wp:posOffset>4500880</wp:posOffset>
@@ -136,154 +1896,7 @@
           </mc:Choice>
           <mc:Fallback>
             <w:pict>
-              <v:rect w14:anchorId="55CCDBC0" id="Rectangle 13" o:spid="_x0000_s1026" style="position:absolute;margin-left:354.4pt;margin-top:-25.2pt;width:63.6pt;height:31.2pt;z-index:251677696;visibility:visible;mso-wrap-style:square;mso-wrap-distance-left:9pt;mso-wrap-distance-top:0;mso-wrap-distance-right:9pt;mso-wrap-distance-bottom:0;mso-position-horizontal:absolute;mso-position-horizontal-relative:text;mso-position-vertical:absolute;mso-position-vertical-relative:text;v-text-anchor:middle" o:gfxdata="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" fillcolor="#156082 [3204]" strokecolor="#030e13 [484]" strokeweight="1.5pt"/>
-            </w:pict>
-          </mc:Fallback>
-        </mc:AlternateContent>
-      </w:r>
-      <w:r>
-        <w:rPr>
-          <w:noProof/>
-        </w:rPr>
-        <mc:AlternateContent>
-          <mc:Choice Requires="wps">
-            <w:drawing>
-              <wp:anchor distT="0" distB="0" distL="114300" distR="114300" simplePos="0" relativeHeight="251676672" behindDoc="0" locked="0" layoutInCell="1" allowOverlap="1" wp14:anchorId="7F730DB8" wp14:editId="67C02752">
-                <wp:simplePos x="0" y="0"/>
-                <wp:positionH relativeFrom="column">
-                  <wp:posOffset>4018280</wp:posOffset>
-                </wp:positionH>
-                <wp:positionV relativeFrom="paragraph">
-                  <wp:posOffset>698500</wp:posOffset>
-                </wp:positionV>
-                <wp:extent cx="960120" cy="1638300"/>
-                <wp:effectExtent l="0" t="38100" r="49530" b="19050"/>
-                <wp:wrapNone/>
-                <wp:docPr id="464401916" name="Straight Arrow Connector 12"/>
-                <wp:cNvGraphicFramePr/>
-                <a:graphic xmlns:a="http://schemas.openxmlformats.org/drawingml/2006/main">
-                  <a:graphicData uri="http://schemas.microsoft.com/office/word/2010/wordprocessingShape">
-                    <wps:wsp>
-                      <wps:cNvCnPr/>
-                      <wps:spPr>
-                        <a:xfrm flipV="1">
-                          <a:off x="0" y="0"/>
-                          <a:ext cx="960120" cy="1638300"/>
-                        </a:xfrm>
-                        <a:prstGeom prst="straightConnector1">
-                          <a:avLst/>
-                        </a:prstGeom>
-                        <a:ln>
-                          <a:tailEnd type="triangle"/>
-                        </a:ln>
-                      </wps:spPr>
-                      <wps:style>
-                        <a:lnRef idx="1">
-                          <a:schemeClr val="accent6"/>
-                        </a:lnRef>
-                        <a:fillRef idx="0">
-                          <a:schemeClr val="accent6"/>
-                        </a:fillRef>
-                        <a:effectRef idx="0">
-                          <a:schemeClr val="accent6"/>
-                        </a:effectRef>
-                        <a:fontRef idx="minor">
-                          <a:schemeClr val="tx1"/>
-                        </a:fontRef>
-                      </wps:style>
-                      <wps:bodyPr/>
-                    </wps:wsp>
-                  </a:graphicData>
-                </a:graphic>
-                <wp14:sizeRelH relativeFrom="margin">
-                  <wp14:pctWidth>0</wp14:pctWidth>
-                </wp14:sizeRelH>
-                <wp14:sizeRelV relativeFrom="margin">
-                  <wp14:pctHeight>0</wp14:pctHeight>
-                </wp14:sizeRelV>
-              </wp:anchor>
-            </w:drawing>
-          </mc:Choice>
-          <mc:Fallback>
-            <w:pict>
-              <v:shape w14:anchorId="292FF814" id="Straight Arrow Connector 12" o:spid="_x0000_s1026" type="#_x0000_t32" style="position:absolute;margin-left:316.4pt;margin-top:55pt;width:75.6pt;height:129pt;flip:y;z-index:251676672;visibility:visible;mso-wrap-style:square;mso-width-percent:0;mso-height-percent:0;mso-wrap-distance-left:9pt;mso-wrap-distance-top:0;mso-wrap-distance-right:9pt;mso-wrap-distance-bottom:0;mso-position-horizontal:absolute;mso-position-horizontal-relative:text;mso-position-vertical:absolute;mso-position-vertical-relative:text;mso-width-percent:0;mso-height-percent:0;mso-width-relative:margin;mso-height-relative:margin" o:gfxdata="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" strokecolor="#4ea72e [3209]" strokeweight="1pt">
-                <v:stroke endarrow="block" joinstyle="miter"/>
-              </v:shape>
-            </w:pict>
-          </mc:Fallback>
-        </mc:AlternateContent>
-      </w:r>
-      <w:r>
-        <w:rPr>
-          <w:noProof/>
-        </w:rPr>
-        <mc:AlternateContent>
-          <mc:Choice Requires="wps">
-            <w:drawing>
-              <wp:anchor distT="0" distB="0" distL="114300" distR="114300" simplePos="0" relativeHeight="251673600" behindDoc="0" locked="0" layoutInCell="1" allowOverlap="1" wp14:anchorId="00FC02AE" wp14:editId="3A9245BF">
-                <wp:simplePos x="0" y="0"/>
-                <wp:positionH relativeFrom="column">
-                  <wp:posOffset>3007360</wp:posOffset>
-                </wp:positionH>
-                <wp:positionV relativeFrom="paragraph">
-                  <wp:posOffset>2225040</wp:posOffset>
-                </wp:positionV>
-                <wp:extent cx="1000760" cy="254000"/>
-                <wp:effectExtent l="0" t="0" r="27940" b="12700"/>
-                <wp:wrapNone/>
-                <wp:docPr id="2067502406" name="Text Box 9"/>
-                <wp:cNvGraphicFramePr/>
-                <a:graphic xmlns:a="http://schemas.openxmlformats.org/drawingml/2006/main">
-                  <a:graphicData uri="http://schemas.microsoft.com/office/word/2010/wordprocessingShape">
-                    <wps:wsp>
-                      <wps:cNvSpPr txBox="1"/>
-                      <wps:spPr>
-                        <a:xfrm>
-                          <a:off x="0" y="0"/>
-                          <a:ext cx="1000760" cy="254000"/>
-                        </a:xfrm>
-                        <a:prstGeom prst="rect">
-                          <a:avLst/>
-                        </a:prstGeom>
-                        <a:solidFill>
-                          <a:schemeClr val="lt1"/>
-                        </a:solidFill>
-                        <a:ln w="6350">
-                          <a:solidFill>
-                            <a:prstClr val="black"/>
-                          </a:solidFill>
-                        </a:ln>
-                      </wps:spPr>
-                      <wps:txbx>
-                        <w:txbxContent>
-                          <w:p/>
-                        </w:txbxContent>
-                      </wps:txbx>
-                      <wps:bodyPr rot="0" spcFirstLastPara="0" vertOverflow="overflow" horzOverflow="overflow" vert="horz" wrap="square" lIns="91440" tIns="45720" rIns="91440" bIns="45720" numCol="1" spcCol="0" rtlCol="0" fromWordArt="0" anchor="t" anchorCtr="0" forceAA="0" compatLnSpc="1">
-                        <a:prstTxWarp prst="textNoShape">
-                          <a:avLst/>
-                        </a:prstTxWarp>
-                        <a:noAutofit/>
-                      </wps:bodyPr>
-                    </wps:wsp>
-                  </a:graphicData>
-                </a:graphic>
-              </wp:anchor>
-            </w:drawing>
-          </mc:Choice>
-          <mc:Fallback>
-            <w:pict>
-              <v:shapetype w14:anchorId="00FC02AE" id="_x0000_t202" coordsize="21600,21600" o:spt="202" path="m,l,21600r21600,l21600,xe">
-                <v:stroke joinstyle="miter"/>
-                <v:path gradientshapeok="t" o:connecttype="rect"/>
-              </v:shapetype>
-              <v:shape id="Text Box 9" o:spid="_x0000_s1026" type="#_x0000_t202" style="position:absolute;margin-left:236.8pt;margin-top:175.2pt;width:78.8pt;height:20pt;z-index:251673600;visibility:visible;mso-wrap-style:square;mso-wrap-distance-left:9pt;mso-wrap-distance-top:0;mso-wrap-distance-right:9pt;mso-wrap-distance-bottom:0;mso-position-horizontal:absolute;mso-position-horizontal-relative:text;mso-position-vertical:absolute;mso-position-vertical-relative:text;v-text-anchor:top" o:gfxdata="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" fillcolor="white [3201]" strokeweight=".5pt">
-                <v:textbox>
-                  <w:txbxContent>
-                    <w:p/>
-                  </w:txbxContent>
-                </v:textbox>
-              </v:shape>
+              <v:rect w14:anchorId="7D29E01F" id="Rectangle 13" o:spid="_x0000_s1026" style="position:absolute;margin-left:354.4pt;margin-top:-25.2pt;width:63.6pt;height:31.2pt;z-index:251677696;visibility:visible;mso-wrap-style:square;mso-wrap-distance-left:9pt;mso-wrap-distance-top:0;mso-wrap-distance-right:9pt;mso-wrap-distance-bottom:0;mso-position-horizontal:absolute;mso-position-horizontal-relative:text;mso-position-vertical:absolute;mso-position-vertical-relative:text;v-text-anchor:middle" o:gfxdata="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" fillcolor="#156082 [3204]" strokecolor="#030e13 [484]" strokeweight="1.5pt"/>
             </w:pict>
           </mc:Fallback>
         </mc:AlternateContent>
@@ -431,397 +2044,7 @@
         <mc:AlternateContent>
           <mc:Choice Requires="wps">
             <w:drawing>
-              <wp:anchor distT="0" distB="0" distL="114300" distR="114300" simplePos="0" relativeHeight="251662336" behindDoc="0" locked="0" layoutInCell="1" allowOverlap="1" wp14:anchorId="11DC3E83" wp14:editId="149F9244">
-                <wp:simplePos x="0" y="0"/>
-                <wp:positionH relativeFrom="column">
-                  <wp:posOffset>2778760</wp:posOffset>
-                </wp:positionH>
-                <wp:positionV relativeFrom="paragraph">
-                  <wp:posOffset>-248920</wp:posOffset>
-                </wp:positionV>
-                <wp:extent cx="1447800" cy="939800"/>
-                <wp:effectExtent l="0" t="0" r="19050" b="12700"/>
-                <wp:wrapNone/>
-                <wp:docPr id="177960350" name="Rectangle 4"/>
-                <wp:cNvGraphicFramePr/>
-                <a:graphic xmlns:a="http://schemas.openxmlformats.org/drawingml/2006/main">
-                  <a:graphicData uri="http://schemas.microsoft.com/office/word/2010/wordprocessingShape">
-                    <wps:wsp>
-                      <wps:cNvSpPr/>
-                      <wps:spPr>
-                        <a:xfrm>
-                          <a:off x="0" y="0"/>
-                          <a:ext cx="1447800" cy="939800"/>
-                        </a:xfrm>
-                        <a:prstGeom prst="rect">
-                          <a:avLst/>
-                        </a:prstGeom>
-                      </wps:spPr>
-                      <wps:style>
-                        <a:lnRef idx="2">
-                          <a:schemeClr val="accent1">
-                            <a:shade val="15000"/>
-                          </a:schemeClr>
-                        </a:lnRef>
-                        <a:fillRef idx="1">
-                          <a:schemeClr val="accent1"/>
-                        </a:fillRef>
-                        <a:effectRef idx="0">
-                          <a:schemeClr val="accent1"/>
-                        </a:effectRef>
-                        <a:fontRef idx="minor">
-                          <a:schemeClr val="lt1"/>
-                        </a:fontRef>
-                      </wps:style>
-                      <wps:txbx>
-                        <w:txbxContent>
-                          <w:p>
-                            <w:pPr>
-                              <w:jc w:val="center"/>
-                            </w:pPr>
-                            <w:proofErr w:type="spellStart"/>
-                            <w:r>
-                              <w:t>idVal</w:t>
-                            </w:r>
-                            <w:proofErr w:type="spellEnd"/>
-                            <w:r>
-                              <w:t>=1</w:t>
-                            </w:r>
-                          </w:p>
-                          <w:p>
-                            <w:pPr>
-                              <w:jc w:val="center"/>
-                            </w:pPr>
-                            <w:proofErr w:type="spellStart"/>
-                            <w:r>
-                              <w:t>nameVal</w:t>
-                            </w:r>
-                            <w:proofErr w:type="spellEnd"/>
-                            <w:r>
-                              <w:t>=</w:t>
-                            </w:r>
-                          </w:p>
-                          <w:p>
-                            <w:pPr>
-                              <w:jc w:val="center"/>
-                            </w:pPr>
-                            <w:proofErr w:type="spellStart"/>
-                            <w:r>
-                              <w:t>salaryVal</w:t>
-                            </w:r>
-                            <w:proofErr w:type="spellEnd"/>
-                            <w:r>
-                              <w:t>= x</w:t>
-                            </w:r>
-                          </w:p>
-                        </w:txbxContent>
-                      </wps:txbx>
-                      <wps:bodyPr rot="0" spcFirstLastPara="0" vertOverflow="overflow" horzOverflow="overflow" vert="horz" wrap="square" lIns="91440" tIns="45720" rIns="91440" bIns="45720" numCol="1" spcCol="0" rtlCol="0" fromWordArt="0" anchor="ctr" anchorCtr="0" forceAA="0" compatLnSpc="1">
-                        <a:prstTxWarp prst="textNoShape">
-                          <a:avLst/>
-                        </a:prstTxWarp>
-                        <a:noAutofit/>
-                      </wps:bodyPr>
-                    </wps:wsp>
-                  </a:graphicData>
-                </a:graphic>
-                <wp14:sizeRelH relativeFrom="margin">
-                  <wp14:pctWidth>0</wp14:pctWidth>
-                </wp14:sizeRelH>
-                <wp14:sizeRelV relativeFrom="margin">
-                  <wp14:pctHeight>0</wp14:pctHeight>
-                </wp14:sizeRelV>
-              </wp:anchor>
-            </w:drawing>
-          </mc:Choice>
-          <mc:Fallback>
-            <w:pict>
-              <v:rect w14:anchorId="11DC3E83" id="Rectangle 4" o:spid="_x0000_s1027" style="position:absolute;margin-left:218.8pt;margin-top:-19.6pt;width:114pt;height:74pt;z-index:251662336;visibility:visible;mso-wrap-style:square;mso-width-percent:0;mso-height-percent:0;mso-wrap-distance-left:9pt;mso-wrap-distance-top:0;mso-wrap-distance-right:9pt;mso-wrap-distance-bottom:0;mso-position-horizontal:absolute;mso-position-horizontal-relative:text;mso-position-vertical:absolute;mso-position-vertical-relative:text;mso-width-percent:0;mso-height-percent:0;mso-width-relative:margin;mso-height-relative:margin;v-text-anchor:middle" o:gfxdata="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" fillcolor="#156082 [3204]" strokecolor="#030e13 [484]" strokeweight="1.5pt">
-                <v:textbox>
-                  <w:txbxContent>
-                    <w:p>
-                      <w:pPr>
-                        <w:jc w:val="center"/>
-                      </w:pPr>
-                      <w:proofErr w:type="spellStart"/>
-                      <w:r>
-                        <w:t>idVal</w:t>
-                      </w:r>
-                      <w:proofErr w:type="spellEnd"/>
-                      <w:r>
-                        <w:t>=1</w:t>
-                      </w:r>
-                    </w:p>
-                    <w:p>
-                      <w:pPr>
-                        <w:jc w:val="center"/>
-                      </w:pPr>
-                      <w:proofErr w:type="spellStart"/>
-                      <w:r>
-                        <w:t>nameVal</w:t>
-                      </w:r>
-                      <w:proofErr w:type="spellEnd"/>
-                      <w:r>
-                        <w:t>=</w:t>
-                      </w:r>
-                    </w:p>
-                    <w:p>
-                      <w:pPr>
-                        <w:jc w:val="center"/>
-                      </w:pPr>
-                      <w:proofErr w:type="spellStart"/>
-                      <w:r>
-                        <w:t>salaryVal</w:t>
-                      </w:r>
-                      <w:proofErr w:type="spellEnd"/>
-                      <w:r>
-                        <w:t>= x</w:t>
-                      </w:r>
-                    </w:p>
-                  </w:txbxContent>
-                </v:textbox>
-              </v:rect>
-            </w:pict>
-          </mc:Fallback>
-        </mc:AlternateContent>
-      </w:r>
-      <w:r>
-        <w:rPr>
-          <w:noProof/>
-        </w:rPr>
-        <mc:AlternateContent>
-          <mc:Choice Requires="wps">
-            <w:drawing>
-              <wp:anchor distT="0" distB="0" distL="114300" distR="114300" simplePos="0" relativeHeight="251664384" behindDoc="0" locked="0" layoutInCell="1" allowOverlap="1" wp14:anchorId="382144D3" wp14:editId="70051C6D">
-                <wp:simplePos x="0" y="0"/>
-                <wp:positionH relativeFrom="column">
-                  <wp:posOffset>2875280</wp:posOffset>
-                </wp:positionH>
-                <wp:positionV relativeFrom="paragraph">
-                  <wp:posOffset>828040</wp:posOffset>
-                </wp:positionV>
-                <wp:extent cx="1239520" cy="1686560"/>
-                <wp:effectExtent l="0" t="0" r="17780" b="27940"/>
-                <wp:wrapNone/>
-                <wp:docPr id="96206858" name="Rectangle 6"/>
-                <wp:cNvGraphicFramePr/>
-                <a:graphic xmlns:a="http://schemas.openxmlformats.org/drawingml/2006/main">
-                  <a:graphicData uri="http://schemas.microsoft.com/office/word/2010/wordprocessingShape">
-                    <wps:wsp>
-                      <wps:cNvSpPr/>
-                      <wps:spPr>
-                        <a:xfrm>
-                          <a:off x="0" y="0"/>
-                          <a:ext cx="1239520" cy="1686560"/>
-                        </a:xfrm>
-                        <a:prstGeom prst="rect">
-                          <a:avLst/>
-                        </a:prstGeom>
-                      </wps:spPr>
-                      <wps:style>
-                        <a:lnRef idx="2">
-                          <a:schemeClr val="accent1">
-                            <a:shade val="15000"/>
-                          </a:schemeClr>
-                        </a:lnRef>
-                        <a:fillRef idx="1">
-                          <a:schemeClr val="accent1"/>
-                        </a:fillRef>
-                        <a:effectRef idx="0">
-                          <a:schemeClr val="accent1"/>
-                        </a:effectRef>
-                        <a:fontRef idx="minor">
-                          <a:schemeClr val="lt1"/>
-                        </a:fontRef>
-                      </wps:style>
-                      <wps:bodyPr rot="0" spcFirstLastPara="0" vertOverflow="overflow" horzOverflow="overflow" vert="horz" wrap="square" lIns="91440" tIns="45720" rIns="91440" bIns="45720" numCol="1" spcCol="0" rtlCol="0" fromWordArt="0" anchor="ctr" anchorCtr="0" forceAA="0" compatLnSpc="1">
-                        <a:prstTxWarp prst="textNoShape">
-                          <a:avLst/>
-                        </a:prstTxWarp>
-                        <a:noAutofit/>
-                      </wps:bodyPr>
-                    </wps:wsp>
-                  </a:graphicData>
-                </a:graphic>
-                <wp14:sizeRelV relativeFrom="margin">
-                  <wp14:pctHeight>0</wp14:pctHeight>
-                </wp14:sizeRelV>
-              </wp:anchor>
-            </w:drawing>
-          </mc:Choice>
-          <mc:Fallback>
-            <w:pict>
-              <v:rect w14:anchorId="1DBF766C" id="Rectangle 6" o:spid="_x0000_s1026" style="position:absolute;margin-left:226.4pt;margin-top:65.2pt;width:97.6pt;height:132.8pt;z-index:251664384;visibility:visible;mso-wrap-style:square;mso-height-percent:0;mso-wrap-distance-left:9pt;mso-wrap-distance-top:0;mso-wrap-distance-right:9pt;mso-wrap-distance-bottom:0;mso-position-horizontal:absolute;mso-position-horizontal-relative:text;mso-position-vertical:absolute;mso-position-vertical-relative:text;mso-height-percent:0;mso-height-relative:margin;v-text-anchor:middle" o:gfxdata="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" fillcolor="#156082 [3204]" strokecolor="#030e13 [484]" strokeweight="1.5pt"/>
-            </w:pict>
-          </mc:Fallback>
-        </mc:AlternateContent>
-      </w:r>
-      <w:r>
-        <w:rPr>
-          <w:noProof/>
-        </w:rPr>
-        <mc:AlternateContent>
-          <mc:Choice Requires="wps">
-            <w:drawing>
-              <wp:anchor distT="0" distB="0" distL="114300" distR="114300" simplePos="0" relativeHeight="251671552" behindDoc="0" locked="0" layoutInCell="1" allowOverlap="1" wp14:anchorId="5A84E308" wp14:editId="3AE3677E">
-                <wp:simplePos x="0" y="0"/>
-                <wp:positionH relativeFrom="column">
-                  <wp:posOffset>3017520</wp:posOffset>
-                </wp:positionH>
-                <wp:positionV relativeFrom="paragraph">
-                  <wp:posOffset>1920240</wp:posOffset>
-                </wp:positionV>
-                <wp:extent cx="1000760" cy="254000"/>
-                <wp:effectExtent l="0" t="0" r="27940" b="12700"/>
-                <wp:wrapNone/>
-                <wp:docPr id="600850388" name="Text Box 9"/>
-                <wp:cNvGraphicFramePr/>
-                <a:graphic xmlns:a="http://schemas.openxmlformats.org/drawingml/2006/main">
-                  <a:graphicData uri="http://schemas.microsoft.com/office/word/2010/wordprocessingShape">
-                    <wps:wsp>
-                      <wps:cNvSpPr txBox="1"/>
-                      <wps:spPr>
-                        <a:xfrm>
-                          <a:off x="0" y="0"/>
-                          <a:ext cx="1000760" cy="254000"/>
-                        </a:xfrm>
-                        <a:prstGeom prst="rect">
-                          <a:avLst/>
-                        </a:prstGeom>
-                        <a:solidFill>
-                          <a:schemeClr val="lt1"/>
-                        </a:solidFill>
-                        <a:ln w="6350">
-                          <a:solidFill>
-                            <a:prstClr val="black"/>
-                          </a:solidFill>
-                        </a:ln>
-                      </wps:spPr>
-                      <wps:txbx>
-                        <w:txbxContent>
-                          <w:p>
-                            <w:r>
-                              <w:t>1000</w:t>
-                            </w:r>
-                          </w:p>
-                        </w:txbxContent>
-                      </wps:txbx>
-                      <wps:bodyPr rot="0" spcFirstLastPara="0" vertOverflow="overflow" horzOverflow="overflow" vert="horz" wrap="square" lIns="91440" tIns="45720" rIns="91440" bIns="45720" numCol="1" spcCol="0" rtlCol="0" fromWordArt="0" anchor="t" anchorCtr="0" forceAA="0" compatLnSpc="1">
-                        <a:prstTxWarp prst="textNoShape">
-                          <a:avLst/>
-                        </a:prstTxWarp>
-                        <a:noAutofit/>
-                      </wps:bodyPr>
-                    </wps:wsp>
-                  </a:graphicData>
-                </a:graphic>
-              </wp:anchor>
-            </w:drawing>
-          </mc:Choice>
-          <mc:Fallback>
-            <w:pict>
-              <v:shape w14:anchorId="5A84E308" id="_x0000_s1028" type="#_x0000_t202" style="position:absolute;margin-left:237.6pt;margin-top:151.2pt;width:78.8pt;height:20pt;z-index:251671552;visibility:visible;mso-wrap-style:square;mso-wrap-distance-left:9pt;mso-wrap-distance-top:0;mso-wrap-distance-right:9pt;mso-wrap-distance-bottom:0;mso-position-horizontal:absolute;mso-position-horizontal-relative:text;mso-position-vertical:absolute;mso-position-vertical-relative:text;v-text-anchor:top" o:gfxdata="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" fillcolor="white [3201]" strokeweight=".5pt">
-                <v:textbox>
-                  <w:txbxContent>
-                    <w:p>
-                      <w:r>
-                        <w:t>1000</w:t>
-                      </w:r>
-                    </w:p>
-                  </w:txbxContent>
-                </v:textbox>
-              </v:shape>
-            </w:pict>
-          </mc:Fallback>
-        </mc:AlternateContent>
-      </w:r>
-      <w:r>
-        <w:rPr>
-          <w:noProof/>
-        </w:rPr>
-        <mc:AlternateContent>
-          <mc:Choice Requires="wps">
-            <w:drawing>
-              <wp:anchor distT="0" distB="0" distL="114300" distR="114300" simplePos="0" relativeHeight="251669504" behindDoc="0" locked="0" layoutInCell="1" allowOverlap="1" wp14:anchorId="03DB898A" wp14:editId="5D49C9F6">
-                <wp:simplePos x="0" y="0"/>
-                <wp:positionH relativeFrom="column">
-                  <wp:posOffset>2997200</wp:posOffset>
-                </wp:positionH>
-                <wp:positionV relativeFrom="paragraph">
-                  <wp:posOffset>1574800</wp:posOffset>
-                </wp:positionV>
-                <wp:extent cx="1000760" cy="254000"/>
-                <wp:effectExtent l="0" t="0" r="27940" b="12700"/>
-                <wp:wrapNone/>
-                <wp:docPr id="891794077" name="Text Box 9"/>
-                <wp:cNvGraphicFramePr/>
-                <a:graphic xmlns:a="http://schemas.openxmlformats.org/drawingml/2006/main">
-                  <a:graphicData uri="http://schemas.microsoft.com/office/word/2010/wordprocessingShape">
-                    <wps:wsp>
-                      <wps:cNvSpPr txBox="1"/>
-                      <wps:spPr>
-                        <a:xfrm>
-                          <a:off x="0" y="0"/>
-                          <a:ext cx="1000760" cy="254000"/>
-                        </a:xfrm>
-                        <a:prstGeom prst="rect">
-                          <a:avLst/>
-                        </a:prstGeom>
-                        <a:solidFill>
-                          <a:schemeClr val="lt1"/>
-                        </a:solidFill>
-                        <a:ln w="6350">
-                          <a:solidFill>
-                            <a:prstClr val="black"/>
-                          </a:solidFill>
-                        </a:ln>
-                      </wps:spPr>
-                      <wps:txbx>
-                        <w:txbxContent>
-                          <w:p>
-                            <w:r>
-                              <w:t>joy</w:t>
-                            </w:r>
-                          </w:p>
-                        </w:txbxContent>
-                      </wps:txbx>
-                      <wps:bodyPr rot="0" spcFirstLastPara="0" vertOverflow="overflow" horzOverflow="overflow" vert="horz" wrap="square" lIns="91440" tIns="45720" rIns="91440" bIns="45720" numCol="1" spcCol="0" rtlCol="0" fromWordArt="0" anchor="t" anchorCtr="0" forceAA="0" compatLnSpc="1">
-                        <a:prstTxWarp prst="textNoShape">
-                          <a:avLst/>
-                        </a:prstTxWarp>
-                        <a:noAutofit/>
-                      </wps:bodyPr>
-                    </wps:wsp>
-                  </a:graphicData>
-                </a:graphic>
-              </wp:anchor>
-            </w:drawing>
-          </mc:Choice>
-          <mc:Fallback>
-            <w:pict>
-              <v:shape w14:anchorId="03DB898A" id="_x0000_s1029" type="#_x0000_t202" style="position:absolute;margin-left:236pt;margin-top:124pt;width:78.8pt;height:20pt;z-index:251669504;visibility:visible;mso-wrap-style:square;mso-wrap-distance-left:9pt;mso-wrap-distance-top:0;mso-wrap-distance-right:9pt;mso-wrap-distance-bottom:0;mso-position-horizontal:absolute;mso-position-horizontal-relative:text;mso-position-vertical:absolute;mso-position-vertical-relative:text;v-text-anchor:top" o:gfxdata="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" fillcolor="white [3201]" strokeweight=".5pt">
-                <v:textbox>
-                  <w:txbxContent>
-                    <w:p>
-                      <w:r>
-                        <w:t>joy</w:t>
-                      </w:r>
-                    </w:p>
-                  </w:txbxContent>
-                </v:textbox>
-              </v:shape>
-            </w:pict>
-          </mc:Fallback>
-        </mc:AlternateContent>
-      </w:r>
-      <w:r>
-        <w:rPr>
-          <w:noProof/>
-        </w:rPr>
-        <mc:AlternateContent>
-          <mc:Choice Requires="wps">
-            <w:drawing>
-              <wp:anchor distT="0" distB="0" distL="114300" distR="114300" simplePos="0" relativeHeight="251667456" behindDoc="0" locked="0" layoutInCell="1" allowOverlap="1" wp14:anchorId="73B5B926" wp14:editId="4442C08D">
+              <wp:anchor distT="0" distB="0" distL="114300" distR="114300" simplePos="0" relativeHeight="251667456" behindDoc="0" locked="0" layoutInCell="1" allowOverlap="1" wp14:anchorId="73B5B926" wp14:editId="2EE9FC33">
                 <wp:simplePos x="0" y="0"/>
                 <wp:positionH relativeFrom="column">
                   <wp:posOffset>2981960</wp:posOffset>
@@ -859,7 +2082,7 @@
                         <w:txbxContent>
                           <w:p>
                             <w:r>
-                              <w:t>1</w:t>
+                              <w:t>JavaScript</w:t>
                             </w:r>
                           </w:p>
                         </w:txbxContent>
@@ -878,12 +2101,12 @@
           </mc:Choice>
           <mc:Fallback>
             <w:pict>
-              <v:shape w14:anchorId="73B5B926" id="_x0000_s1030" type="#_x0000_t202" style="position:absolute;margin-left:234.8pt;margin-top:99.2pt;width:78.8pt;height:20pt;z-index:251667456;visibility:visible;mso-wrap-style:square;mso-wrap-distance-left:9pt;mso-wrap-distance-top:0;mso-wrap-distance-right:9pt;mso-wrap-distance-bottom:0;mso-position-horizontal:absolute;mso-position-horizontal-relative:text;mso-position-vertical:absolute;mso-position-vertical-relative:text;v-text-anchor:top" o:gfxdata="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" fillcolor="white [3201]" strokeweight=".5pt">
+              <v:shape w14:anchorId="73B5B926" id="_x0000_s1040" type="#_x0000_t202" style="position:absolute;margin-left:234.8pt;margin-top:99.2pt;width:78.8pt;height:20pt;z-index:251667456;visibility:visible;mso-wrap-style:square;mso-wrap-distance-left:9pt;mso-wrap-distance-top:0;mso-wrap-distance-right:9pt;mso-wrap-distance-bottom:0;mso-position-horizontal:absolute;mso-position-horizontal-relative:text;mso-position-vertical:absolute;mso-position-vertical-relative:text;v-text-anchor:top" o:gfxdata="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" fillcolor="white [3201]" strokeweight=".5pt">
                 <v:textbox>
                   <w:txbxContent>
                     <w:p>
                       <w:r>
-                        <w:t>1</w:t>
+                        <w:t>JavaScript</w:t>
                       </w:r>
                     </w:p>
                   </w:txbxContent>
@@ -900,73 +2123,7 @@
         <mc:AlternateContent>
           <mc:Choice Requires="wps">
             <w:drawing>
-              <wp:anchor distT="0" distB="0" distL="114300" distR="114300" simplePos="0" relativeHeight="251666432" behindDoc="0" locked="0" layoutInCell="1" allowOverlap="1" wp14:anchorId="3B9E936E" wp14:editId="688F753E">
-                <wp:simplePos x="0" y="0"/>
-                <wp:positionH relativeFrom="column">
-                  <wp:posOffset>1391920</wp:posOffset>
-                </wp:positionH>
-                <wp:positionV relativeFrom="paragraph">
-                  <wp:posOffset>675640</wp:posOffset>
-                </wp:positionV>
-                <wp:extent cx="1407160" cy="370840"/>
-                <wp:effectExtent l="0" t="0" r="78740" b="67310"/>
-                <wp:wrapNone/>
-                <wp:docPr id="418244899" name="Straight Arrow Connector 8"/>
-                <wp:cNvGraphicFramePr/>
-                <a:graphic xmlns:a="http://schemas.openxmlformats.org/drawingml/2006/main">
-                  <a:graphicData uri="http://schemas.microsoft.com/office/word/2010/wordprocessingShape">
-                    <wps:wsp>
-                      <wps:cNvCnPr/>
-                      <wps:spPr>
-                        <a:xfrm>
-                          <a:off x="0" y="0"/>
-                          <a:ext cx="1407160" cy="370840"/>
-                        </a:xfrm>
-                        <a:prstGeom prst="straightConnector1">
-                          <a:avLst/>
-                        </a:prstGeom>
-                        <a:ln>
-                          <a:tailEnd type="triangle"/>
-                        </a:ln>
-                      </wps:spPr>
-                      <wps:style>
-                        <a:lnRef idx="1">
-                          <a:schemeClr val="accent6"/>
-                        </a:lnRef>
-                        <a:fillRef idx="0">
-                          <a:schemeClr val="accent6"/>
-                        </a:fillRef>
-                        <a:effectRef idx="0">
-                          <a:schemeClr val="accent6"/>
-                        </a:effectRef>
-                        <a:fontRef idx="minor">
-                          <a:schemeClr val="tx1"/>
-                        </a:fontRef>
-                      </wps:style>
-                      <wps:bodyPr/>
-                    </wps:wsp>
-                  </a:graphicData>
-                </a:graphic>
-              </wp:anchor>
-            </w:drawing>
-          </mc:Choice>
-          <mc:Fallback>
-            <w:pict>
-              <v:shape w14:anchorId="6FB686AC" id="Straight Arrow Connector 8" o:spid="_x0000_s1026" type="#_x0000_t32" style="position:absolute;margin-left:109.6pt;margin-top:53.2pt;width:110.8pt;height:29.2pt;z-index:251666432;visibility:visible;mso-wrap-style:square;mso-wrap-distance-left:9pt;mso-wrap-distance-top:0;mso-wrap-distance-right:9pt;mso-wrap-distance-bottom:0;mso-position-horizontal:absolute;mso-position-horizontal-relative:text;mso-position-vertical:absolute;mso-position-vertical-relative:text" o:gfxdata="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" strokecolor="#4ea72e [3209]" strokeweight="1pt">
-                <v:stroke endarrow="block" joinstyle="miter"/>
-              </v:shape>
-            </w:pict>
-          </mc:Fallback>
-        </mc:AlternateContent>
-      </w:r>
-      <w:r>
-        <w:rPr>
-          <w:noProof/>
-        </w:rPr>
-        <mc:AlternateContent>
-          <mc:Choice Requires="wps">
-            <w:drawing>
-              <wp:anchor distT="0" distB="0" distL="114300" distR="114300" simplePos="0" relativeHeight="251665408" behindDoc="0" locked="0" layoutInCell="1" allowOverlap="1" wp14:anchorId="295B9BB6" wp14:editId="29BFEAA3">
+              <wp:anchor distT="0" distB="0" distL="114300" distR="114300" simplePos="0" relativeHeight="251665408" behindDoc="0" locked="0" layoutInCell="1" allowOverlap="1" wp14:anchorId="295B9BB6" wp14:editId="42F72510">
                 <wp:simplePos x="0" y="0"/>
                 <wp:positionH relativeFrom="column">
                   <wp:posOffset>2961640</wp:posOffset>
@@ -1003,6 +2160,9 @@
                       <wps:txbx>
                         <w:txbxContent>
                           <w:p>
+                            <w:pPr>
+                              <w:shd w:val="clear" w:color="auto" w:fill="595959" w:themeFill="text1" w:themeFillTint="A6"/>
+                            </w:pPr>
                             <w:r>
                               <w:t>Proto: object</w:t>
                             </w:r>
@@ -1029,10 +2189,13 @@
           </mc:Choice>
           <mc:Fallback>
             <w:pict>
-              <v:shape w14:anchorId="295B9BB6" id="Text Box 7" o:spid="_x0000_s1031" type="#_x0000_t202" style="position:absolute;margin-left:233.2pt;margin-top:72.4pt;width:83.2pt;height:21.2pt;z-index:251665408;visibility:visible;mso-wrap-style:square;mso-width-percent:0;mso-height-percent:0;mso-wrap-distance-left:9pt;mso-wrap-distance-top:0;mso-wrap-distance-right:9pt;mso-wrap-distance-bottom:0;mso-position-horizontal:absolute;mso-position-horizontal-relative:text;mso-position-vertical:absolute;mso-position-vertical-relative:text;mso-width-percent:0;mso-height-percent:0;mso-width-relative:margin;mso-height-relative:margin;v-text-anchor:top" o:gfxdata="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" fillcolor="white [3201]" strokeweight=".5pt">
+              <v:shape w14:anchorId="295B9BB6" id="_x0000_s1041" type="#_x0000_t202" style="position:absolute;margin-left:233.2pt;margin-top:72.4pt;width:83.2pt;height:21.2pt;z-index:251665408;visibility:visible;mso-wrap-style:square;mso-width-percent:0;mso-height-percent:0;mso-wrap-distance-left:9pt;mso-wrap-distance-top:0;mso-wrap-distance-right:9pt;mso-wrap-distance-bottom:0;mso-position-horizontal:absolute;mso-position-horizontal-relative:text;mso-position-vertical:absolute;mso-position-vertical-relative:text;mso-width-percent:0;mso-height-percent:0;mso-width-relative:margin;mso-height-relative:margin;v-text-anchor:top" o:gfxdata="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" fillcolor="white [3201]" strokeweight=".5pt">
                 <v:textbox>
                   <w:txbxContent>
                     <w:p>
+                      <w:pPr>
+                        <w:shd w:val="clear" w:color="auto" w:fill="595959" w:themeFill="text1" w:themeFillTint="A6"/>
+                      </w:pPr>
                       <w:r>
                         <w:t>Proto: object</w:t>
                       </w:r>
@@ -1051,208 +2214,7 @@
         <mc:AlternateContent>
           <mc:Choice Requires="wps">
             <w:drawing>
-              <wp:anchor distT="0" distB="0" distL="114300" distR="114300" simplePos="0" relativeHeight="251663360" behindDoc="0" locked="0" layoutInCell="1" allowOverlap="1" wp14:anchorId="08DB0072" wp14:editId="5B6079D6">
-                <wp:simplePos x="0" y="0"/>
-                <wp:positionH relativeFrom="column">
-                  <wp:posOffset>1432560</wp:posOffset>
-                </wp:positionH>
-                <wp:positionV relativeFrom="paragraph">
-                  <wp:posOffset>157480</wp:posOffset>
-                </wp:positionV>
-                <wp:extent cx="1351280" cy="157480"/>
-                <wp:effectExtent l="0" t="57150" r="20320" b="33020"/>
-                <wp:wrapNone/>
-                <wp:docPr id="1048397135" name="Straight Arrow Connector 5"/>
-                <wp:cNvGraphicFramePr/>
-                <a:graphic xmlns:a="http://schemas.openxmlformats.org/drawingml/2006/main">
-                  <a:graphicData uri="http://schemas.microsoft.com/office/word/2010/wordprocessingShape">
-                    <wps:wsp>
-                      <wps:cNvCnPr/>
-                      <wps:spPr>
-                        <a:xfrm flipV="1">
-                          <a:off x="0" y="0"/>
-                          <a:ext cx="1351280" cy="157480"/>
-                        </a:xfrm>
-                        <a:prstGeom prst="straightConnector1">
-                          <a:avLst/>
-                        </a:prstGeom>
-                        <a:ln>
-                          <a:tailEnd type="triangle"/>
-                        </a:ln>
-                      </wps:spPr>
-                      <wps:style>
-                        <a:lnRef idx="1">
-                          <a:schemeClr val="accent6"/>
-                        </a:lnRef>
-                        <a:fillRef idx="0">
-                          <a:schemeClr val="accent6"/>
-                        </a:fillRef>
-                        <a:effectRef idx="0">
-                          <a:schemeClr val="accent6"/>
-                        </a:effectRef>
-                        <a:fontRef idx="minor">
-                          <a:schemeClr val="tx1"/>
-                        </a:fontRef>
-                      </wps:style>
-                      <wps:bodyPr/>
-                    </wps:wsp>
-                  </a:graphicData>
-                </a:graphic>
-              </wp:anchor>
-            </w:drawing>
-          </mc:Choice>
-          <mc:Fallback>
-            <w:pict>
-              <v:shape w14:anchorId="2AD237D9" id="Straight Arrow Connector 5" o:spid="_x0000_s1026" type="#_x0000_t32" style="position:absolute;margin-left:112.8pt;margin-top:12.4pt;width:106.4pt;height:12.4pt;flip:y;z-index:251663360;visibility:visible;mso-wrap-style:square;mso-wrap-distance-left:9pt;mso-wrap-distance-top:0;mso-wrap-distance-right:9pt;mso-wrap-distance-bottom:0;mso-position-horizontal:absolute;mso-position-horizontal-relative:text;mso-position-vertical:absolute;mso-position-vertical-relative:text" o:gfxdata="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" strokecolor="#4ea72e [3209]" strokeweight="1pt">
-                <v:stroke endarrow="block" joinstyle="miter"/>
-              </v:shape>
-            </w:pict>
-          </mc:Fallback>
-        </mc:AlternateContent>
-      </w:r>
-      <w:r>
-        <w:rPr>
-          <w:noProof/>
-        </w:rPr>
-        <mc:AlternateContent>
-          <mc:Choice Requires="wps">
-            <w:drawing>
-              <wp:anchor distT="0" distB="0" distL="114300" distR="114300" simplePos="0" relativeHeight="251660288" behindDoc="0" locked="0" layoutInCell="1" allowOverlap="1" wp14:anchorId="30F231CC" wp14:editId="2F163C2D">
-                <wp:simplePos x="0" y="0"/>
-                <wp:positionH relativeFrom="column">
-                  <wp:posOffset>396240</wp:posOffset>
-                </wp:positionH>
-                <wp:positionV relativeFrom="paragraph">
-                  <wp:posOffset>66040</wp:posOffset>
-                </wp:positionV>
-                <wp:extent cx="1483360" cy="1285240"/>
-                <wp:effectExtent l="0" t="0" r="21590" b="10160"/>
-                <wp:wrapNone/>
-                <wp:docPr id="1949848620" name="Rectangle 2"/>
-                <wp:cNvGraphicFramePr/>
-                <a:graphic xmlns:a="http://schemas.openxmlformats.org/drawingml/2006/main">
-                  <a:graphicData uri="http://schemas.microsoft.com/office/word/2010/wordprocessingShape">
-                    <wps:wsp>
-                      <wps:cNvSpPr/>
-                      <wps:spPr>
-                        <a:xfrm>
-                          <a:off x="0" y="0"/>
-                          <a:ext cx="1483360" cy="1285240"/>
-                        </a:xfrm>
-                        <a:prstGeom prst="rect">
-                          <a:avLst/>
-                        </a:prstGeom>
-                      </wps:spPr>
-                      <wps:style>
-                        <a:lnRef idx="2">
-                          <a:schemeClr val="accent1">
-                            <a:shade val="15000"/>
-                          </a:schemeClr>
-                        </a:lnRef>
-                        <a:fillRef idx="1">
-                          <a:schemeClr val="accent1"/>
-                        </a:fillRef>
-                        <a:effectRef idx="0">
-                          <a:schemeClr val="accent1"/>
-                        </a:effectRef>
-                        <a:fontRef idx="minor">
-                          <a:schemeClr val="lt1"/>
-                        </a:fontRef>
-                      </wps:style>
-                      <wps:txbx>
-                        <w:txbxContent>
-                          <w:p>
-                            <w:pPr>
-                              <w:jc w:val="center"/>
-                            </w:pPr>
-                            <w:proofErr w:type="spellStart"/>
-                            <w:r>
-                              <w:t>Varobj</w:t>
-                            </w:r>
-                            <w:proofErr w:type="spellEnd"/>
-                          </w:p>
-                          <w:p>
-                            <w:pPr>
-                              <w:jc w:val="center"/>
-                            </w:pPr>
-                            <w:r>
-                              <w:t>This</w:t>
-                            </w:r>
-                          </w:p>
-                          <w:p>
-                            <w:pPr>
-                              <w:jc w:val="center"/>
-                            </w:pPr>
-                            <w:r>
-                              <w:t>scope</w:t>
-                            </w:r>
-                          </w:p>
-                        </w:txbxContent>
-                      </wps:txbx>
-                      <wps:bodyPr rot="0" spcFirstLastPara="0" vertOverflow="overflow" horzOverflow="overflow" vert="horz" wrap="square" lIns="91440" tIns="45720" rIns="91440" bIns="45720" numCol="1" spcCol="0" rtlCol="0" fromWordArt="0" anchor="ctr" anchorCtr="0" forceAA="0" compatLnSpc="1">
-                        <a:prstTxWarp prst="textNoShape">
-                          <a:avLst/>
-                        </a:prstTxWarp>
-                        <a:noAutofit/>
-                      </wps:bodyPr>
-                    </wps:wsp>
-                  </a:graphicData>
-                </a:graphic>
-                <wp14:sizeRelH relativeFrom="margin">
-                  <wp14:pctWidth>0</wp14:pctWidth>
-                </wp14:sizeRelH>
-                <wp14:sizeRelV relativeFrom="margin">
-                  <wp14:pctHeight>0</wp14:pctHeight>
-                </wp14:sizeRelV>
-              </wp:anchor>
-            </w:drawing>
-          </mc:Choice>
-          <mc:Fallback>
-            <w:pict>
-              <v:rect w14:anchorId="30F231CC" id="Rectangle 2" o:spid="_x0000_s1032" style="position:absolute;margin-left:31.2pt;margin-top:5.2pt;width:116.8pt;height:101.2pt;z-index:251660288;visibility:visible;mso-wrap-style:square;mso-width-percent:0;mso-height-percent:0;mso-wrap-distance-left:9pt;mso-wrap-distance-top:0;mso-wrap-distance-right:9pt;mso-wrap-distance-bottom:0;mso-position-horizontal:absolute;mso-position-horizontal-relative:text;mso-position-vertical:absolute;mso-position-vertical-relative:text;mso-width-percent:0;mso-height-percent:0;mso-width-relative:margin;mso-height-relative:margin;v-text-anchor:middle" o:gfxdata="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" fillcolor="#156082 [3204]" strokecolor="#030e13 [484]" strokeweight="1.5pt">
-                <v:textbox>
-                  <w:txbxContent>
-                    <w:p>
-                      <w:pPr>
-                        <w:jc w:val="center"/>
-                      </w:pPr>
-                      <w:proofErr w:type="spellStart"/>
-                      <w:r>
-                        <w:t>Varobj</w:t>
-                      </w:r>
-                      <w:proofErr w:type="spellEnd"/>
-                    </w:p>
-                    <w:p>
-                      <w:pPr>
-                        <w:jc w:val="center"/>
-                      </w:pPr>
-                      <w:r>
-                        <w:t>This</w:t>
-                      </w:r>
-                    </w:p>
-                    <w:p>
-                      <w:pPr>
-                        <w:jc w:val="center"/>
-                      </w:pPr>
-                      <w:r>
-                        <w:t>scope</w:t>
-                      </w:r>
-                    </w:p>
-                  </w:txbxContent>
-                </v:textbox>
-              </v:rect>
-            </w:pict>
-          </mc:Fallback>
-        </mc:AlternateContent>
-      </w:r>
-      <w:r>
-        <w:rPr>
-          <w:noProof/>
-        </w:rPr>
-        <mc:AlternateContent>
-          <mc:Choice Requires="wps">
-            <w:drawing>
-              <wp:anchor distT="0" distB="0" distL="114300" distR="114300" simplePos="0" relativeHeight="251661312" behindDoc="0" locked="0" layoutInCell="1" allowOverlap="1" wp14:anchorId="68D418CC" wp14:editId="59F065B3">
+              <wp:anchor distT="0" distB="0" distL="114300" distR="114300" simplePos="0" relativeHeight="251661312" behindDoc="0" locked="0" layoutInCell="1" allowOverlap="1" wp14:anchorId="68D418CC" wp14:editId="645E73F8">
                 <wp:simplePos x="0" y="0"/>
                 <wp:positionH relativeFrom="column">
                   <wp:posOffset>309880</wp:posOffset>
@@ -1326,7 +2288,7 @@
           </mc:Choice>
           <mc:Fallback>
             <w:pict>
-              <v:rect w14:anchorId="68D418CC" id="Rectangle 3" o:spid="_x0000_s1033" style="position:absolute;margin-left:24.4pt;margin-top:110.8pt;width:130.8pt;height:40pt;z-index:251661312;visibility:visible;mso-wrap-style:square;mso-width-percent:0;mso-height-percent:0;mso-wrap-distance-left:9pt;mso-wrap-distance-top:0;mso-wrap-distance-right:9pt;mso-wrap-distance-bottom:0;mso-position-horizontal:absolute;mso-position-horizontal-relative:text;mso-position-vertical:absolute;mso-position-vertical-relative:text;mso-width-percent:0;mso-height-percent:0;mso-width-relative:margin;mso-height-relative:margin;v-text-anchor:middle" o:gfxdata="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" fillcolor="#156082 [3204]" strokecolor="#030e13 [484]" strokeweight="1.5pt">
+              <v:rect w14:anchorId="68D418CC" id="Rectangle 3" o:spid="_x0000_s1042" style="position:absolute;margin-left:24.4pt;margin-top:110.8pt;width:130.8pt;height:40pt;z-index:251661312;visibility:visible;mso-wrap-style:square;mso-width-percent:0;mso-height-percent:0;mso-wrap-distance-left:9pt;mso-wrap-distance-top:0;mso-wrap-distance-right:9pt;mso-wrap-distance-bottom:0;mso-position-horizontal:absolute;mso-position-horizontal-relative:text;mso-position-vertical:absolute;mso-position-vertical-relative:text;mso-width-percent:0;mso-height-percent:0;mso-width-relative:margin;mso-height-relative:margin;v-text-anchor:middle" o:gfxdata="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" fillcolor="#156082 [3204]" strokecolor="#030e13 [484]" strokeweight="1.5pt">
                 <v:textbox>
                   <w:txbxContent>
                     <w:p>
@@ -1340,77 +2302,6 @@
                   </w:txbxContent>
                 </v:textbox>
               </v:rect>
-            </w:pict>
-          </mc:Fallback>
-        </mc:AlternateContent>
-      </w:r>
-      <w:r>
-        <w:rPr>
-          <w:noProof/>
-        </w:rPr>
-        <mc:AlternateContent>
-          <mc:Choice Requires="wps">
-            <w:drawing>
-              <wp:anchor distT="0" distB="0" distL="114300" distR="114300" simplePos="0" relativeHeight="251659264" behindDoc="0" locked="0" layoutInCell="1" allowOverlap="1" wp14:anchorId="0DC6EAC3" wp14:editId="7C7CD914">
-                <wp:simplePos x="0" y="0"/>
-                <wp:positionH relativeFrom="column">
-                  <wp:posOffset>-289560</wp:posOffset>
-                </wp:positionH>
-                <wp:positionV relativeFrom="paragraph">
-                  <wp:posOffset>-416560</wp:posOffset>
-                </wp:positionV>
-                <wp:extent cx="6624320" cy="2981960"/>
-                <wp:effectExtent l="0" t="0" r="24130" b="27940"/>
-                <wp:wrapNone/>
-                <wp:docPr id="190388641" name="Rectangle 1"/>
-                <wp:cNvGraphicFramePr/>
-                <a:graphic xmlns:a="http://schemas.openxmlformats.org/drawingml/2006/main">
-                  <a:graphicData uri="http://schemas.microsoft.com/office/word/2010/wordprocessingShape">
-                    <wps:wsp>
-                      <wps:cNvSpPr/>
-                      <wps:spPr>
-                        <a:xfrm>
-                          <a:off x="0" y="0"/>
-                          <a:ext cx="6624320" cy="2981960"/>
-                        </a:xfrm>
-                        <a:prstGeom prst="rect">
-                          <a:avLst/>
-                        </a:prstGeom>
-                      </wps:spPr>
-                      <wps:style>
-                        <a:lnRef idx="2">
-                          <a:schemeClr val="accent1">
-                            <a:shade val="15000"/>
-                          </a:schemeClr>
-                        </a:lnRef>
-                        <a:fillRef idx="1">
-                          <a:schemeClr val="accent1"/>
-                        </a:fillRef>
-                        <a:effectRef idx="0">
-                          <a:schemeClr val="accent1"/>
-                        </a:effectRef>
-                        <a:fontRef idx="minor">
-                          <a:schemeClr val="lt1"/>
-                        </a:fontRef>
-                      </wps:style>
-                      <wps:bodyPr rot="0" spcFirstLastPara="0" vertOverflow="overflow" horzOverflow="overflow" vert="horz" wrap="square" lIns="91440" tIns="45720" rIns="91440" bIns="45720" numCol="1" spcCol="0" rtlCol="0" fromWordArt="0" anchor="ctr" anchorCtr="0" forceAA="0" compatLnSpc="1">
-                        <a:prstTxWarp prst="textNoShape">
-                          <a:avLst/>
-                        </a:prstTxWarp>
-                        <a:noAutofit/>
-                      </wps:bodyPr>
-                    </wps:wsp>
-                  </a:graphicData>
-                </a:graphic>
-                <wp14:sizeRelH relativeFrom="margin">
-                  <wp14:pctWidth>0</wp14:pctWidth>
-                </wp14:sizeRelH>
-              </wp:anchor>
-            </w:drawing>
-          </mc:Choice>
-          <mc:Fallback>
-            <w:pict>
-              <v:rect w14:anchorId="0E0FB3F5" id="Rectangle 1" o:spid="_x0000_s1026" style="position:absolute;margin-left:-22.8pt;margin-top:-32.8pt;width:521.6pt;height:234.8pt;z-index:251659264;visibility:visible;mso-wrap-style:square;mso-width-percent:0;mso-wrap-distance-left:9pt;mso-wrap-distance-top:0;mso-wrap-distance-right:9pt;mso-wrap-distance-bottom:0;mso-position-horizontal:absolute;mso-position-horizontal-relative:text;mso-position-vertical:absolute;mso-position-vertical-relative:text;mso-width-percent:0;mso-width-relative:margin;v-text-anchor:middle" o:gfxdata="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" fillcolor="#156082 [3204]" strokecolor="#030e13 [484]" strokeweight="1.5pt"/>
             </w:pict>
           </mc:Fallback>
         </mc:AlternateContent>
@@ -1826,7 +2717,7 @@
   <w:style w:type="paragraph" w:default="1" w:styleId="Normal">
     <w:name w:val="Normal"/>
     <w:qFormat/>
-    <w:rsid w:val="00FA2A1C"/>
+    <w:rsid w:val="00D01285"/>
   </w:style>
   <w:style w:type="paragraph" w:styleId="Heading1">
     <w:name w:val="heading 1"/>

</xml_diff>